<commit_message>
Checkpoint CMAPSS con Modelos y CV para RNN, LSTM y GRU
</commit_message>
<xml_diff>
--- a/TFM/AeroGPT/data/CMAPSS/Temporal_Ex.docx
+++ b/TFM/AeroGPT/data/CMAPSS/Temporal_Ex.docx
@@ -45,7 +45,7 @@
     <w:p>
       <w:r>
         <w:pict w14:anchorId="29A4D7AE">
-          <v:rect id="_x0000_i1154" style="width:0;height:1.5pt" o:hralign="center" o:hrstd="t" o:hr="t" fillcolor="#a0a0a0" stroked="f"/>
+          <v:rect id="_x0000_i1025" style="width:0;height:1.5pt" o:hralign="center" o:hrstd="t" o:hr="t" fillcolor="#a0a0a0" stroked="f"/>
         </w:pict>
       </w:r>
     </w:p>
@@ -187,7 +187,7 @@
     <w:p>
       <w:r>
         <w:pict w14:anchorId="33F2EBA7">
-          <v:rect id="_x0000_i1155" style="width:0;height:1.5pt" o:hralign="center" o:hrstd="t" o:hr="t" fillcolor="#a0a0a0" stroked="f"/>
+          <v:rect id="_x0000_i1026" style="width:0;height:1.5pt" o:hralign="center" o:hrstd="t" o:hr="t" fillcolor="#a0a0a0" stroked="f"/>
         </w:pict>
       </w:r>
     </w:p>
@@ -438,7 +438,7 @@
     <w:p>
       <w:r>
         <w:pict w14:anchorId="09473D6A">
-          <v:rect id="_x0000_i1156" style="width:0;height:1.5pt" o:hralign="center" o:hrstd="t" o:hr="t" fillcolor="#a0a0a0" stroked="f"/>
+          <v:rect id="_x0000_i1027" style="width:0;height:1.5pt" o:hralign="center" o:hrstd="t" o:hr="t" fillcolor="#a0a0a0" stroked="f"/>
         </w:pict>
       </w:r>
     </w:p>
@@ -502,17 +502,12 @@
         <w:t>{ciclo}) - \</w:t>
       </w:r>
       <w:proofErr w:type="spellStart"/>
-      <w:proofErr w:type="gramStart"/>
       <w:r>
         <w:t>text</w:t>
       </w:r>
       <w:proofErr w:type="spellEnd"/>
       <w:r>
-        <w:t>{</w:t>
-      </w:r>
-      <w:proofErr w:type="gramEnd"/>
-      <w:r>
-        <w:t>ciclo actual}</w:t>
+        <w:t>{ciclo actual}</w:t>
       </w:r>
       <w:r>
         <w:br/>
@@ -679,15 +674,7 @@
     </w:p>
     <w:p>
       <w:r>
-        <w:t xml:space="preserve">En el conjunto </w:t>
-      </w:r>
-      <w:proofErr w:type="gramStart"/>
-      <w:r>
-        <w:t>de test</w:t>
-      </w:r>
-      <w:proofErr w:type="gramEnd"/>
-      <w:r>
-        <w:t xml:space="preserve">, la predicción se realiza a partir de </w:t>
+        <w:t xml:space="preserve">En el conjunto de test, la predicción se realiza a partir de </w:t>
       </w:r>
       <w:r>
         <w:rPr>
@@ -703,7 +690,7 @@
     <w:p>
       <w:r>
         <w:pict w14:anchorId="0D0BB386">
-          <v:rect id="_x0000_i1157" style="width:0;height:1.5pt" o:hralign="center" o:hrstd="t" o:hr="t" fillcolor="#a0a0a0" stroked="f"/>
+          <v:rect id="_x0000_i1028" style="width:0;height:1.5pt" o:hralign="center" o:hrstd="t" o:hr="t" fillcolor="#a0a0a0" stroked="f"/>
         </w:pict>
       </w:r>
     </w:p>
@@ -966,7 +953,7 @@
     <w:p>
       <w:r>
         <w:pict w14:anchorId="14F2CF02">
-          <v:rect id="_x0000_i1158" style="width:0;height:1.5pt" o:hralign="center" o:hrstd="t" o:hr="t" fillcolor="#a0a0a0" stroked="f"/>
+          <v:rect id="_x0000_i1029" style="width:0;height:1.5pt" o:hralign="center" o:hrstd="t" o:hr="t" fillcolor="#a0a0a0" stroked="f"/>
         </w:pict>
       </w:r>
     </w:p>
@@ -1236,7 +1223,7 @@
     <w:p>
       <w:r>
         <w:pict w14:anchorId="41FC4376">
-          <v:rect id="_x0000_i1159" style="width:0;height:1.5pt" o:hralign="center" o:hrstd="t" o:hr="t" fillcolor="#a0a0a0" stroked="f"/>
+          <v:rect id="_x0000_i1030" style="width:0;height:1.5pt" o:hralign="center" o:hrstd="t" o:hr="t" fillcolor="#a0a0a0" stroked="f"/>
         </w:pict>
       </w:r>
     </w:p>
@@ -1339,22 +1326,9 @@
       </w:r>
     </w:p>
     <w:p>
-      <w:proofErr w:type="gramStart"/>
       <w:r>
         <w:lastRenderedPageBreak/>
-        <w:t>Además</w:t>
-      </w:r>
-      <w:proofErr w:type="gramEnd"/>
-      <w:r>
-        <w:t xml:space="preserve"> se comparó el RUL real del conjunto </w:t>
-      </w:r>
-      <w:proofErr w:type="gramStart"/>
-      <w:r>
-        <w:t>de test</w:t>
-      </w:r>
-      <w:proofErr w:type="gramEnd"/>
-      <w:r>
-        <w:t xml:space="preserve"> frente al RUL predicho.</w:t>
+        <w:t>Además se comparó el RUL real del conjunto de test frente al RUL predicho.</w:t>
       </w:r>
     </w:p>
     <w:p>
@@ -1562,7 +1536,7 @@
     <w:p>
       <w:r>
         <w:pict w14:anchorId="05B4E781">
-          <v:rect id="_x0000_i1160" style="width:0;height:1.5pt" o:hralign="center" o:hrstd="t" o:hr="t" fillcolor="#a0a0a0" stroked="f"/>
+          <v:rect id="_x0000_i1031" style="width:0;height:1.5pt" o:hralign="center" o:hrstd="t" o:hr="t" fillcolor="#a0a0a0" stroked="f"/>
         </w:pict>
       </w:r>
     </w:p>
@@ -1636,7 +1610,7 @@
     <w:p>
       <w:r>
         <w:pict w14:anchorId="0821E6FB">
-          <v:rect id="_x0000_i1161" style="width:0;height:1.5pt" o:hralign="center" o:hrstd="t" o:hr="t" fillcolor="#a0a0a0" stroked="f"/>
+          <v:rect id="_x0000_i1032" style="width:0;height:1.5pt" o:hralign="center" o:hrstd="t" o:hr="t" fillcolor="#a0a0a0" stroked="f"/>
         </w:pict>
       </w:r>
     </w:p>
@@ -1690,6 +1664,2580 @@
       </w:r>
       <w:r>
         <w:t xml:space="preserve"> para cerrar el capítulo del TFM.</w:t>
+      </w:r>
+    </w:p>
+    <w:p/>
+    <w:p/>
+    <w:p/>
+    <w:p/>
+    <w:p/>
+    <w:p/>
+    <w:p/>
+    <w:p/>
+    <w:p/>
+    <w:p/>
+    <w:p/>
+    <w:p/>
+    <w:p/>
+    <w:p/>
+    <w:p/>
+    <w:p/>
+    <w:p/>
+    <w:p/>
+    <w:p/>
+    <w:p/>
+    <w:p/>
+    <w:p/>
+    <w:p/>
+    <w:p/>
+    <w:p/>
+    <w:p/>
+    <w:p/>
+    <w:p/>
+    <w:p/>
+    <w:p/>
+    <w:p/>
+    <w:p/>
+    <w:p/>
+    <w:p/>
+    <w:p/>
+    <w:p/>
+    <w:p/>
+    <w:p/>
+    <w:p/>
+    <w:p/>
+    <w:p/>
+    <w:p/>
+    <w:p/>
+    <w:p/>
+    <w:p/>
+    <w:p>
+      <w:r>
+        <w:t xml:space="preserve">Perfecto, David. Te preparo la versión </w:t>
+      </w:r>
+      <w:r>
+        <w:rPr>
+          <w:b/>
+          <w:bCs/>
+        </w:rPr>
+        <w:t>listo para copiar en tu TFM</w:t>
+      </w:r>
+      <w:r>
+        <w:t>, con un estilo académico, referencias a figuras/tablas y todo estructurado. Aquí va:</w:t>
+      </w:r>
+    </w:p>
+    <w:p>
+      <w:r>
+        <w:pict w14:anchorId="3111A8FB">
+          <v:rect id="_x0000_i1081" style="width:0;height:1.5pt" o:hralign="center" o:hrstd="t" o:hr="t" fillcolor="#a0a0a0" stroked="f"/>
+        </w:pict>
+      </w:r>
+    </w:p>
+    <w:p>
+      <w:pPr>
+        <w:rPr>
+          <w:b/>
+          <w:bCs/>
+        </w:rPr>
+      </w:pPr>
+      <w:r>
+        <w:rPr>
+          <w:b/>
+          <w:bCs/>
+        </w:rPr>
+        <w:t>Módulo CMAPSS – Predicción de RUL en motores aeronáuticos</w:t>
+      </w:r>
+    </w:p>
+    <w:p>
+      <w:pPr>
+        <w:rPr>
+          <w:b/>
+          <w:bCs/>
+        </w:rPr>
+      </w:pPr>
+      <w:r>
+        <w:rPr>
+          <w:b/>
+          <w:bCs/>
+        </w:rPr>
+        <w:t>1. Introducción</w:t>
+      </w:r>
+    </w:p>
+    <w:p>
+      <w:r>
+        <w:t xml:space="preserve">El </w:t>
+      </w:r>
+      <w:proofErr w:type="spellStart"/>
+      <w:r>
+        <w:t>dataset</w:t>
+      </w:r>
+      <w:proofErr w:type="spellEnd"/>
+      <w:r>
+        <w:t xml:space="preserve"> </w:t>
+      </w:r>
+      <w:r>
+        <w:rPr>
+          <w:b/>
+          <w:bCs/>
+        </w:rPr>
+        <w:t>CMAPSS (</w:t>
+      </w:r>
+      <w:proofErr w:type="spellStart"/>
+      <w:r>
+        <w:rPr>
+          <w:b/>
+          <w:bCs/>
+        </w:rPr>
+        <w:t>Commercial</w:t>
+      </w:r>
+      <w:proofErr w:type="spellEnd"/>
+      <w:r>
+        <w:rPr>
+          <w:b/>
+          <w:bCs/>
+        </w:rPr>
+        <w:t xml:space="preserve"> Modular Aero-</w:t>
+      </w:r>
+      <w:proofErr w:type="spellStart"/>
+      <w:r>
+        <w:rPr>
+          <w:b/>
+          <w:bCs/>
+        </w:rPr>
+        <w:t>Propulsion</w:t>
+      </w:r>
+      <w:proofErr w:type="spellEnd"/>
+      <w:r>
+        <w:rPr>
+          <w:b/>
+          <w:bCs/>
+        </w:rPr>
+        <w:t xml:space="preserve"> </w:t>
+      </w:r>
+      <w:proofErr w:type="spellStart"/>
+      <w:r>
+        <w:rPr>
+          <w:b/>
+          <w:bCs/>
+        </w:rPr>
+        <w:t>System</w:t>
+      </w:r>
+      <w:proofErr w:type="spellEnd"/>
+      <w:r>
+        <w:rPr>
+          <w:b/>
+          <w:bCs/>
+        </w:rPr>
+        <w:t xml:space="preserve"> </w:t>
+      </w:r>
+      <w:proofErr w:type="spellStart"/>
+      <w:r>
+        <w:rPr>
+          <w:b/>
+          <w:bCs/>
+        </w:rPr>
+        <w:t>Simulation</w:t>
+      </w:r>
+      <w:proofErr w:type="spellEnd"/>
+      <w:r>
+        <w:rPr>
+          <w:b/>
+          <w:bCs/>
+        </w:rPr>
+        <w:t>)</w:t>
+      </w:r>
+      <w:r>
+        <w:t>, desarrollado por la NASA, simula el comportamiento y degradación de motores a reacción durante ciclos de operación hasta el fallo. Cada motor es registrado mediante series temporales multivariantes, que incluyen:</w:t>
+      </w:r>
+    </w:p>
+    <w:p>
+      <w:pPr>
+        <w:numPr>
+          <w:ilvl w:val="0"/>
+          <w:numId w:val="21"/>
+        </w:numPr>
+      </w:pPr>
+      <w:r>
+        <w:rPr>
+          <w:b/>
+          <w:bCs/>
+        </w:rPr>
+        <w:lastRenderedPageBreak/>
+        <w:t>Parámetros operativos (</w:t>
+      </w:r>
+      <w:proofErr w:type="spellStart"/>
+      <w:r>
+        <w:rPr>
+          <w:b/>
+          <w:bCs/>
+        </w:rPr>
+        <w:t>settings</w:t>
+      </w:r>
+      <w:proofErr w:type="spellEnd"/>
+      <w:r>
+        <w:rPr>
+          <w:b/>
+          <w:bCs/>
+        </w:rPr>
+        <w:t>)</w:t>
+      </w:r>
+      <w:r>
+        <w:t>: Configuraciones que afectan la operación del motor, como flujo de combustible, presión de entrada y régimen de operación.</w:t>
+      </w:r>
+    </w:p>
+    <w:p>
+      <w:pPr>
+        <w:numPr>
+          <w:ilvl w:val="0"/>
+          <w:numId w:val="21"/>
+        </w:numPr>
+      </w:pPr>
+      <w:r>
+        <w:rPr>
+          <w:b/>
+          <w:bCs/>
+        </w:rPr>
+        <w:t>Sensores (</w:t>
+      </w:r>
+      <w:proofErr w:type="spellStart"/>
+      <w:r>
+        <w:rPr>
+          <w:b/>
+          <w:bCs/>
+        </w:rPr>
+        <w:t>sensors</w:t>
+      </w:r>
+      <w:proofErr w:type="spellEnd"/>
+      <w:r>
+        <w:rPr>
+          <w:b/>
+          <w:bCs/>
+        </w:rPr>
+        <w:t>)</w:t>
+      </w:r>
+      <w:r>
+        <w:t>: Medidas físicas como temperatura, presión, RPM y vibraciones del motor.</w:t>
+      </w:r>
+    </w:p>
+    <w:p>
+      <w:pPr>
+        <w:numPr>
+          <w:ilvl w:val="0"/>
+          <w:numId w:val="21"/>
+        </w:numPr>
+      </w:pPr>
+      <w:r>
+        <w:rPr>
+          <w:b/>
+          <w:bCs/>
+        </w:rPr>
+        <w:t>RUL (</w:t>
+      </w:r>
+      <w:proofErr w:type="spellStart"/>
+      <w:r>
+        <w:rPr>
+          <w:b/>
+          <w:bCs/>
+        </w:rPr>
+        <w:t>Remaining</w:t>
+      </w:r>
+      <w:proofErr w:type="spellEnd"/>
+      <w:r>
+        <w:rPr>
+          <w:b/>
+          <w:bCs/>
+        </w:rPr>
+        <w:t xml:space="preserve"> </w:t>
+      </w:r>
+      <w:proofErr w:type="spellStart"/>
+      <w:r>
+        <w:rPr>
+          <w:b/>
+          <w:bCs/>
+        </w:rPr>
+        <w:t>Useful</w:t>
+      </w:r>
+      <w:proofErr w:type="spellEnd"/>
+      <w:r>
+        <w:rPr>
+          <w:b/>
+          <w:bCs/>
+        </w:rPr>
+        <w:t xml:space="preserve"> </w:t>
+      </w:r>
+      <w:proofErr w:type="spellStart"/>
+      <w:r>
+        <w:rPr>
+          <w:b/>
+          <w:bCs/>
+        </w:rPr>
+        <w:t>Life</w:t>
+      </w:r>
+      <w:proofErr w:type="spellEnd"/>
+      <w:r>
+        <w:rPr>
+          <w:b/>
+          <w:bCs/>
+        </w:rPr>
+        <w:t>)</w:t>
+      </w:r>
+      <w:r>
+        <w:t>: Número de ciclos restantes hasta que se espera un fallo. Este dato solo está disponible para entrenamiento.</w:t>
+      </w:r>
+    </w:p>
+    <w:p>
+      <w:r>
+        <w:t xml:space="preserve">Los motores comienzan su operación en condiciones normales con diferentes niveles de desgaste inicial. La degradación se produce a lo largo de los ciclos, y los datos contienen </w:t>
+      </w:r>
+      <w:r>
+        <w:rPr>
+          <w:b/>
+          <w:bCs/>
+        </w:rPr>
+        <w:t>ruido de sensores</w:t>
+      </w:r>
+      <w:r>
+        <w:t xml:space="preserve"> simulado para reflejar la variabilidad real.</w:t>
+      </w:r>
+    </w:p>
+    <w:p>
+      <w:r>
+        <w:t xml:space="preserve">Los </w:t>
+      </w:r>
+      <w:proofErr w:type="spellStart"/>
+      <w:r>
+        <w:t>subdatasets</w:t>
+      </w:r>
+      <w:proofErr w:type="spellEnd"/>
+      <w:r>
+        <w:t xml:space="preserve"> FD001–FD004 presentan distintas combinaciones de condiciones operativas y modos de fallo:</w:t>
+      </w:r>
+    </w:p>
+    <w:tbl>
+      <w:tblPr>
+        <w:tblW w:w="0" w:type="auto"/>
+        <w:tblCellSpacing w:w="15" w:type="dxa"/>
+        <w:tblCellMar>
+          <w:top w:w="15" w:type="dxa"/>
+          <w:left w:w="15" w:type="dxa"/>
+          <w:bottom w:w="15" w:type="dxa"/>
+          <w:right w:w="15" w:type="dxa"/>
+        </w:tblCellMar>
+        <w:tblLook w:val="04A0" w:firstRow="1" w:lastRow="0" w:firstColumn="1" w:lastColumn="0" w:noHBand="0" w:noVBand="1"/>
+      </w:tblPr>
+      <w:tblGrid>
+        <w:gridCol w:w="933"/>
+        <w:gridCol w:w="717"/>
+        <w:gridCol w:w="631"/>
+        <w:gridCol w:w="1440"/>
+        <w:gridCol w:w="2789"/>
+      </w:tblGrid>
+      <w:tr>
+        <w:trPr>
+          <w:tblHeader/>
+          <w:tblCellSpacing w:w="15" w:type="dxa"/>
+        </w:trPr>
+        <w:tc>
+          <w:tcPr>
+            <w:tcW w:w="0" w:type="auto"/>
+            <w:vAlign w:val="center"/>
+            <w:hideMark/>
+          </w:tcPr>
+          <w:p>
+            <w:pPr>
+              <w:rPr>
+                <w:b/>
+                <w:bCs/>
+              </w:rPr>
+            </w:pPr>
+            <w:proofErr w:type="spellStart"/>
+            <w:r>
+              <w:rPr>
+                <w:b/>
+                <w:bCs/>
+              </w:rPr>
+              <w:t>Dataset</w:t>
+            </w:r>
+            <w:proofErr w:type="spellEnd"/>
+          </w:p>
+        </w:tc>
+        <w:tc>
+          <w:tcPr>
+            <w:tcW w:w="0" w:type="auto"/>
+            <w:vAlign w:val="center"/>
+            <w:hideMark/>
+          </w:tcPr>
+          <w:p>
+            <w:pPr>
+              <w:rPr>
+                <w:b/>
+                <w:bCs/>
+              </w:rPr>
+            </w:pPr>
+            <w:r>
+              <w:rPr>
+                <w:b/>
+                <w:bCs/>
+              </w:rPr>
+              <w:t>#Train</w:t>
+            </w:r>
+          </w:p>
+        </w:tc>
+        <w:tc>
+          <w:tcPr>
+            <w:tcW w:w="0" w:type="auto"/>
+            <w:vAlign w:val="center"/>
+            <w:hideMark/>
+          </w:tcPr>
+          <w:p>
+            <w:pPr>
+              <w:rPr>
+                <w:b/>
+                <w:bCs/>
+              </w:rPr>
+            </w:pPr>
+            <w:r>
+              <w:rPr>
+                <w:b/>
+                <w:bCs/>
+              </w:rPr>
+              <w:t>#Test</w:t>
+            </w:r>
+          </w:p>
+        </w:tc>
+        <w:tc>
+          <w:tcPr>
+            <w:tcW w:w="0" w:type="auto"/>
+            <w:vAlign w:val="center"/>
+            <w:hideMark/>
+          </w:tcPr>
+          <w:p>
+            <w:pPr>
+              <w:rPr>
+                <w:b/>
+                <w:bCs/>
+              </w:rPr>
+            </w:pPr>
+            <w:r>
+              <w:rPr>
+                <w:b/>
+                <w:bCs/>
+              </w:rPr>
+              <w:t>Condiciones</w:t>
+            </w:r>
+          </w:p>
+        </w:tc>
+        <w:tc>
+          <w:tcPr>
+            <w:tcW w:w="0" w:type="auto"/>
+            <w:vAlign w:val="center"/>
+            <w:hideMark/>
+          </w:tcPr>
+          <w:p>
+            <w:pPr>
+              <w:rPr>
+                <w:b/>
+                <w:bCs/>
+              </w:rPr>
+            </w:pPr>
+            <w:r>
+              <w:rPr>
+                <w:b/>
+                <w:bCs/>
+              </w:rPr>
+              <w:t>Modos de fallo</w:t>
+            </w:r>
+          </w:p>
+        </w:tc>
+      </w:tr>
+      <w:tr>
+        <w:trPr>
+          <w:tblCellSpacing w:w="15" w:type="dxa"/>
+        </w:trPr>
+        <w:tc>
+          <w:tcPr>
+            <w:tcW w:w="0" w:type="auto"/>
+            <w:vAlign w:val="center"/>
+            <w:hideMark/>
+          </w:tcPr>
+          <w:p>
+            <w:r>
+              <w:t>FD001</w:t>
+            </w:r>
+          </w:p>
+        </w:tc>
+        <w:tc>
+          <w:tcPr>
+            <w:tcW w:w="0" w:type="auto"/>
+            <w:vAlign w:val="center"/>
+            <w:hideMark/>
+          </w:tcPr>
+          <w:p>
+            <w:r>
+              <w:t>100</w:t>
+            </w:r>
+          </w:p>
+        </w:tc>
+        <w:tc>
+          <w:tcPr>
+            <w:tcW w:w="0" w:type="auto"/>
+            <w:vAlign w:val="center"/>
+            <w:hideMark/>
+          </w:tcPr>
+          <w:p>
+            <w:r>
+              <w:t>100</w:t>
+            </w:r>
+          </w:p>
+        </w:tc>
+        <w:tc>
+          <w:tcPr>
+            <w:tcW w:w="0" w:type="auto"/>
+            <w:vAlign w:val="center"/>
+            <w:hideMark/>
+          </w:tcPr>
+          <w:p>
+            <w:r>
+              <w:t xml:space="preserve">1 (Sea </w:t>
+            </w:r>
+            <w:proofErr w:type="spellStart"/>
+            <w:r>
+              <w:t>Level</w:t>
+            </w:r>
+            <w:proofErr w:type="spellEnd"/>
+            <w:r>
+              <w:t>)</w:t>
+            </w:r>
+          </w:p>
+        </w:tc>
+        <w:tc>
+          <w:tcPr>
+            <w:tcW w:w="0" w:type="auto"/>
+            <w:vAlign w:val="center"/>
+            <w:hideMark/>
+          </w:tcPr>
+          <w:p>
+            <w:r>
+              <w:t xml:space="preserve">1 (HPC </w:t>
+            </w:r>
+            <w:proofErr w:type="spellStart"/>
+            <w:r>
+              <w:t>Degradation</w:t>
+            </w:r>
+            <w:proofErr w:type="spellEnd"/>
+            <w:r>
+              <w:t>)</w:t>
+            </w:r>
+          </w:p>
+        </w:tc>
+      </w:tr>
+      <w:tr>
+        <w:trPr>
+          <w:tblCellSpacing w:w="15" w:type="dxa"/>
+        </w:trPr>
+        <w:tc>
+          <w:tcPr>
+            <w:tcW w:w="0" w:type="auto"/>
+            <w:vAlign w:val="center"/>
+            <w:hideMark/>
+          </w:tcPr>
+          <w:p>
+            <w:r>
+              <w:t>FD002</w:t>
+            </w:r>
+          </w:p>
+        </w:tc>
+        <w:tc>
+          <w:tcPr>
+            <w:tcW w:w="0" w:type="auto"/>
+            <w:vAlign w:val="center"/>
+            <w:hideMark/>
+          </w:tcPr>
+          <w:p>
+            <w:r>
+              <w:t>260</w:t>
+            </w:r>
+          </w:p>
+        </w:tc>
+        <w:tc>
+          <w:tcPr>
+            <w:tcW w:w="0" w:type="auto"/>
+            <w:vAlign w:val="center"/>
+            <w:hideMark/>
+          </w:tcPr>
+          <w:p>
+            <w:r>
+              <w:t>259</w:t>
+            </w:r>
+          </w:p>
+        </w:tc>
+        <w:tc>
+          <w:tcPr>
+            <w:tcW w:w="0" w:type="auto"/>
+            <w:vAlign w:val="center"/>
+            <w:hideMark/>
+          </w:tcPr>
+          <w:p>
+            <w:r>
+              <w:t>6</w:t>
+            </w:r>
+          </w:p>
+        </w:tc>
+        <w:tc>
+          <w:tcPr>
+            <w:tcW w:w="0" w:type="auto"/>
+            <w:vAlign w:val="center"/>
+            <w:hideMark/>
+          </w:tcPr>
+          <w:p>
+            <w:r>
+              <w:t xml:space="preserve">1 (HPC </w:t>
+            </w:r>
+            <w:proofErr w:type="spellStart"/>
+            <w:r>
+              <w:t>Degradation</w:t>
+            </w:r>
+            <w:proofErr w:type="spellEnd"/>
+            <w:r>
+              <w:t>)</w:t>
+            </w:r>
+          </w:p>
+        </w:tc>
+      </w:tr>
+      <w:tr>
+        <w:trPr>
+          <w:tblCellSpacing w:w="15" w:type="dxa"/>
+        </w:trPr>
+        <w:tc>
+          <w:tcPr>
+            <w:tcW w:w="0" w:type="auto"/>
+            <w:vAlign w:val="center"/>
+            <w:hideMark/>
+          </w:tcPr>
+          <w:p>
+            <w:r>
+              <w:t>FD003</w:t>
+            </w:r>
+          </w:p>
+        </w:tc>
+        <w:tc>
+          <w:tcPr>
+            <w:tcW w:w="0" w:type="auto"/>
+            <w:vAlign w:val="center"/>
+            <w:hideMark/>
+          </w:tcPr>
+          <w:p>
+            <w:r>
+              <w:t>100</w:t>
+            </w:r>
+          </w:p>
+        </w:tc>
+        <w:tc>
+          <w:tcPr>
+            <w:tcW w:w="0" w:type="auto"/>
+            <w:vAlign w:val="center"/>
+            <w:hideMark/>
+          </w:tcPr>
+          <w:p>
+            <w:r>
+              <w:t>100</w:t>
+            </w:r>
+          </w:p>
+        </w:tc>
+        <w:tc>
+          <w:tcPr>
+            <w:tcW w:w="0" w:type="auto"/>
+            <w:vAlign w:val="center"/>
+            <w:hideMark/>
+          </w:tcPr>
+          <w:p>
+            <w:r>
+              <w:t>1</w:t>
+            </w:r>
+          </w:p>
+        </w:tc>
+        <w:tc>
+          <w:tcPr>
+            <w:tcW w:w="0" w:type="auto"/>
+            <w:vAlign w:val="center"/>
+            <w:hideMark/>
+          </w:tcPr>
+          <w:p>
+            <w:r>
+              <w:t xml:space="preserve">2 (HPC + Fan </w:t>
+            </w:r>
+            <w:proofErr w:type="spellStart"/>
+            <w:r>
+              <w:t>Degradation</w:t>
+            </w:r>
+            <w:proofErr w:type="spellEnd"/>
+            <w:r>
+              <w:t>)</w:t>
+            </w:r>
+          </w:p>
+        </w:tc>
+      </w:tr>
+      <w:tr>
+        <w:trPr>
+          <w:tblCellSpacing w:w="15" w:type="dxa"/>
+        </w:trPr>
+        <w:tc>
+          <w:tcPr>
+            <w:tcW w:w="0" w:type="auto"/>
+            <w:vAlign w:val="center"/>
+            <w:hideMark/>
+          </w:tcPr>
+          <w:p>
+            <w:r>
+              <w:t>FD004</w:t>
+            </w:r>
+          </w:p>
+        </w:tc>
+        <w:tc>
+          <w:tcPr>
+            <w:tcW w:w="0" w:type="auto"/>
+            <w:vAlign w:val="center"/>
+            <w:hideMark/>
+          </w:tcPr>
+          <w:p>
+            <w:r>
+              <w:t>248</w:t>
+            </w:r>
+          </w:p>
+        </w:tc>
+        <w:tc>
+          <w:tcPr>
+            <w:tcW w:w="0" w:type="auto"/>
+            <w:vAlign w:val="center"/>
+            <w:hideMark/>
+          </w:tcPr>
+          <w:p>
+            <w:r>
+              <w:t>249</w:t>
+            </w:r>
+          </w:p>
+        </w:tc>
+        <w:tc>
+          <w:tcPr>
+            <w:tcW w:w="0" w:type="auto"/>
+            <w:vAlign w:val="center"/>
+            <w:hideMark/>
+          </w:tcPr>
+          <w:p>
+            <w:r>
+              <w:t>6</w:t>
+            </w:r>
+          </w:p>
+        </w:tc>
+        <w:tc>
+          <w:tcPr>
+            <w:tcW w:w="0" w:type="auto"/>
+            <w:vAlign w:val="center"/>
+            <w:hideMark/>
+          </w:tcPr>
+          <w:p>
+            <w:r>
+              <w:t xml:space="preserve">2 (HPC + Fan </w:t>
+            </w:r>
+            <w:proofErr w:type="spellStart"/>
+            <w:r>
+              <w:t>Degradation</w:t>
+            </w:r>
+            <w:proofErr w:type="spellEnd"/>
+            <w:r>
+              <w:t>)</w:t>
+            </w:r>
+          </w:p>
+        </w:tc>
+      </w:tr>
+    </w:tbl>
+    <w:p>
+      <w:r>
+        <w:rPr>
+          <w:b/>
+          <w:bCs/>
+        </w:rPr>
+        <w:t>Nota:</w:t>
+      </w:r>
+      <w:r>
+        <w:t xml:space="preserve"> “Condiciones” se refiere a combinaciones de parámetros de operación; “Modos de fallo” identifica los componentes degradados: HPC (High </w:t>
+      </w:r>
+      <w:proofErr w:type="spellStart"/>
+      <w:r>
+        <w:t>Pressure</w:t>
+      </w:r>
+      <w:proofErr w:type="spellEnd"/>
+      <w:r>
+        <w:t xml:space="preserve"> </w:t>
+      </w:r>
+      <w:proofErr w:type="spellStart"/>
+      <w:r>
+        <w:t>Compressor</w:t>
+      </w:r>
+      <w:proofErr w:type="spellEnd"/>
+      <w:r>
+        <w:t>) y/o Fan.</w:t>
+      </w:r>
+    </w:p>
+    <w:p>
+      <w:r>
+        <w:rPr>
+          <w:b/>
+          <w:bCs/>
+        </w:rPr>
+        <w:t>Objetivo</w:t>
+      </w:r>
+      <w:r>
+        <w:t>: Predecir la RUL de cada motor para habilitar mantenimiento predictivo y evaluación de riesgo.</w:t>
+      </w:r>
+    </w:p>
+    <w:p>
+      <w:r>
+        <w:pict w14:anchorId="0D8C840C">
+          <v:rect id="_x0000_i1082" style="width:0;height:1.5pt" o:hralign="center" o:hrstd="t" o:hr="t" fillcolor="#a0a0a0" stroked="f"/>
+        </w:pict>
+      </w:r>
+    </w:p>
+    <w:p>
+      <w:pPr>
+        <w:rPr>
+          <w:b/>
+          <w:bCs/>
+        </w:rPr>
+      </w:pPr>
+      <w:r>
+        <w:rPr>
+          <w:b/>
+          <w:bCs/>
+        </w:rPr>
+        <w:t>2. Preprocesamiento y extracción de características</w:t>
+      </w:r>
+    </w:p>
+    <w:p>
+      <w:r>
+        <w:t>Para entrenar el modelo, se siguieron los siguientes pasos:</w:t>
+      </w:r>
+    </w:p>
+    <w:p>
+      <w:pPr>
+        <w:numPr>
+          <w:ilvl w:val="0"/>
+          <w:numId w:val="22"/>
+        </w:numPr>
+      </w:pPr>
+      <w:r>
+        <w:rPr>
+          <w:b/>
+          <w:bCs/>
+        </w:rPr>
+        <w:t xml:space="preserve">Selección de </w:t>
+      </w:r>
+      <w:proofErr w:type="spellStart"/>
+      <w:r>
+        <w:rPr>
+          <w:b/>
+          <w:bCs/>
+        </w:rPr>
+        <w:t>features</w:t>
+      </w:r>
+      <w:proofErr w:type="spellEnd"/>
+      <w:r>
+        <w:t>:</w:t>
+      </w:r>
+    </w:p>
+    <w:p>
+      <w:pPr>
+        <w:numPr>
+          <w:ilvl w:val="1"/>
+          <w:numId w:val="22"/>
+        </w:numPr>
+      </w:pPr>
+      <w:r>
+        <w:t>Tres parámetros operativos: setting_1, setting_2, setting_3.</w:t>
+      </w:r>
+    </w:p>
+    <w:p>
+      <w:pPr>
+        <w:numPr>
+          <w:ilvl w:val="1"/>
+          <w:numId w:val="22"/>
+        </w:numPr>
+      </w:pPr>
+      <w:r>
+        <w:t>21 sensores representativos: s_1 a s_21.</w:t>
+      </w:r>
+    </w:p>
+    <w:p>
+      <w:pPr>
+        <w:numPr>
+          <w:ilvl w:val="1"/>
+          <w:numId w:val="22"/>
+        </w:numPr>
+      </w:pPr>
+      <w:r>
+        <w:t xml:space="preserve">Total de </w:t>
+      </w:r>
+      <w:r>
+        <w:rPr>
+          <w:b/>
+          <w:bCs/>
+        </w:rPr>
+        <w:t>24 variables de entrada</w:t>
+      </w:r>
+      <w:r>
+        <w:t>.</w:t>
+      </w:r>
+    </w:p>
+    <w:p>
+      <w:pPr>
+        <w:numPr>
+          <w:ilvl w:val="0"/>
+          <w:numId w:val="22"/>
+        </w:numPr>
+      </w:pPr>
+      <w:r>
+        <w:rPr>
+          <w:b/>
+          <w:bCs/>
+        </w:rPr>
+        <w:lastRenderedPageBreak/>
+        <w:t>Normalización</w:t>
+      </w:r>
+      <w:r>
+        <w:t>:</w:t>
+      </w:r>
+      <w:r>
+        <w:br/>
+        <w:t xml:space="preserve">Se aplica </w:t>
+      </w:r>
+      <w:proofErr w:type="spellStart"/>
+      <w:r>
+        <w:rPr>
+          <w:b/>
+          <w:bCs/>
+        </w:rPr>
+        <w:t>StandardScaler</w:t>
+      </w:r>
+      <w:proofErr w:type="spellEnd"/>
+      <w:r>
+        <w:t xml:space="preserve"> a las variables, eliminando sesgos de escala entre sensores y </w:t>
+      </w:r>
+      <w:proofErr w:type="spellStart"/>
+      <w:r>
+        <w:t>settings</w:t>
+      </w:r>
+      <w:proofErr w:type="spellEnd"/>
+      <w:r>
+        <w:t>.</w:t>
+      </w:r>
+    </w:p>
+    <w:p>
+      <w:pPr>
+        <w:numPr>
+          <w:ilvl w:val="0"/>
+          <w:numId w:val="22"/>
+        </w:numPr>
+      </w:pPr>
+      <w:r>
+        <w:rPr>
+          <w:b/>
+          <w:bCs/>
+        </w:rPr>
+        <w:t>Creación de secuencias temporales (ventaneo)</w:t>
+      </w:r>
+      <w:r>
+        <w:t>:</w:t>
+      </w:r>
+    </w:p>
+    <w:p>
+      <w:pPr>
+        <w:numPr>
+          <w:ilvl w:val="1"/>
+          <w:numId w:val="22"/>
+        </w:numPr>
+      </w:pPr>
+      <w:r>
+        <w:t>Cada motor se divide en ventanas de longitud T=50 ciclos.</w:t>
+      </w:r>
+    </w:p>
+    <w:p>
+      <w:pPr>
+        <w:numPr>
+          <w:ilvl w:val="1"/>
+          <w:numId w:val="22"/>
+        </w:numPr>
+      </w:pPr>
+      <w:r>
+        <w:t>Esto permite que la GRU capture patrones de degradación temporal, reflejando la dinámica de los sensores y condiciones operativas.</w:t>
+      </w:r>
+    </w:p>
+    <w:p>
+      <w:pPr>
+        <w:numPr>
+          <w:ilvl w:val="1"/>
+          <w:numId w:val="22"/>
+        </w:numPr>
+      </w:pPr>
+      <w:r>
+        <w:t xml:space="preserve">Si el motor tiene menos de 50 ciclos, se aplica </w:t>
+      </w:r>
+      <w:proofErr w:type="spellStart"/>
+      <w:r>
+        <w:rPr>
+          <w:b/>
+          <w:bCs/>
+        </w:rPr>
+        <w:t>padding</w:t>
+      </w:r>
+      <w:proofErr w:type="spellEnd"/>
+      <w:r>
+        <w:rPr>
+          <w:b/>
+          <w:bCs/>
+        </w:rPr>
+        <w:t xml:space="preserve"> con ceros</w:t>
+      </w:r>
+      <w:r>
+        <w:t>.</w:t>
+      </w:r>
+    </w:p>
+    <w:p>
+      <w:pPr>
+        <w:numPr>
+          <w:ilvl w:val="0"/>
+          <w:numId w:val="22"/>
+        </w:numPr>
+      </w:pPr>
+      <w:r>
+        <w:rPr>
+          <w:b/>
+          <w:bCs/>
+        </w:rPr>
+        <w:t>Variable objetivo</w:t>
+      </w:r>
+      <w:r>
+        <w:t>:</w:t>
+      </w:r>
+    </w:p>
+    <w:p>
+      <w:pPr>
+        <w:numPr>
+          <w:ilvl w:val="1"/>
+          <w:numId w:val="22"/>
+        </w:numPr>
+      </w:pPr>
+      <w:r>
+        <w:t>RUL calculado como:</w:t>
+      </w:r>
+      <w:r>
+        <w:br/>
+        <w:t>[</w:t>
+      </w:r>
+      <w:r>
+        <w:br/>
+        <w:t>RUL = \</w:t>
+      </w:r>
+      <w:proofErr w:type="spellStart"/>
+      <w:r>
+        <w:t>text</w:t>
+      </w:r>
+      <w:proofErr w:type="spellEnd"/>
+      <w:r>
+        <w:t>{</w:t>
+      </w:r>
+      <w:proofErr w:type="spellStart"/>
+      <w:r>
+        <w:t>ciclo_máximo_del_motor</w:t>
+      </w:r>
+      <w:proofErr w:type="spellEnd"/>
+      <w:r>
+        <w:t>} - \</w:t>
+      </w:r>
+      <w:proofErr w:type="spellStart"/>
+      <w:r>
+        <w:t>text</w:t>
+      </w:r>
+      <w:proofErr w:type="spellEnd"/>
+      <w:r>
+        <w:t>{</w:t>
+      </w:r>
+      <w:proofErr w:type="spellStart"/>
+      <w:r>
+        <w:t>ciclo_actual</w:t>
+      </w:r>
+      <w:proofErr w:type="spellEnd"/>
+      <w:r>
+        <w:t>}</w:t>
+      </w:r>
+      <w:r>
+        <w:br/>
+        <w:t>]</w:t>
+      </w:r>
+    </w:p>
+    <w:p>
+      <w:pPr>
+        <w:numPr>
+          <w:ilvl w:val="1"/>
+          <w:numId w:val="22"/>
+        </w:numPr>
+      </w:pPr>
+      <w:r>
+        <w:t>El objetivo es predecir un valor continuo que represente la vida útil restante del motor.</w:t>
+      </w:r>
+    </w:p>
+    <w:p>
+      <w:r>
+        <w:rPr>
+          <w:b/>
+          <w:bCs/>
+        </w:rPr>
+        <w:t>Figura sugerida</w:t>
+      </w:r>
+      <w:r>
+        <w:t>: Esquema de preprocesamiento y ventana temporal para un motor.</w:t>
+      </w:r>
+    </w:p>
+    <w:p>
+      <w:r>
+        <w:pict w14:anchorId="62B2722F">
+          <v:rect id="_x0000_i1083" style="width:0;height:1.5pt" o:hralign="center" o:hrstd="t" o:hr="t" fillcolor="#a0a0a0" stroked="f"/>
+        </w:pict>
+      </w:r>
+    </w:p>
+    <w:p>
+      <w:pPr>
+        <w:rPr>
+          <w:b/>
+          <w:bCs/>
+        </w:rPr>
+      </w:pPr>
+      <w:r>
+        <w:rPr>
+          <w:b/>
+          <w:bCs/>
+        </w:rPr>
+        <w:t>3. Modelo GRU y justificación</w:t>
+      </w:r>
+    </w:p>
+    <w:p>
+      <w:r>
+        <w:t xml:space="preserve">Se emplea una </w:t>
+      </w:r>
+      <w:r>
+        <w:rPr>
+          <w:b/>
+          <w:bCs/>
+        </w:rPr>
+        <w:t>Red Neuronal Recurrente GRU</w:t>
+      </w:r>
+      <w:r>
+        <w:t xml:space="preserve"> (</w:t>
+      </w:r>
+      <w:proofErr w:type="spellStart"/>
+      <w:r>
+        <w:t>Gated</w:t>
+      </w:r>
+      <w:proofErr w:type="spellEnd"/>
+      <w:r>
+        <w:t xml:space="preserve"> </w:t>
+      </w:r>
+      <w:proofErr w:type="spellStart"/>
+      <w:r>
+        <w:t>Recurrent</w:t>
+      </w:r>
+      <w:proofErr w:type="spellEnd"/>
+      <w:r>
+        <w:t xml:space="preserve"> </w:t>
+      </w:r>
+      <w:proofErr w:type="spellStart"/>
+      <w:r>
+        <w:t>Unit</w:t>
+      </w:r>
+      <w:proofErr w:type="spellEnd"/>
+      <w:r>
+        <w:t>):</w:t>
+      </w:r>
+    </w:p>
+    <w:p>
+      <w:pPr>
+        <w:numPr>
+          <w:ilvl w:val="0"/>
+          <w:numId w:val="23"/>
+        </w:numPr>
+      </w:pPr>
+      <w:r>
+        <w:rPr>
+          <w:b/>
+          <w:bCs/>
+        </w:rPr>
+        <w:t>Arquitectura</w:t>
+      </w:r>
+      <w:r>
+        <w:t>:</w:t>
+      </w:r>
+    </w:p>
+    <w:p>
+      <w:pPr>
+        <w:numPr>
+          <w:ilvl w:val="1"/>
+          <w:numId w:val="23"/>
+        </w:numPr>
+      </w:pPr>
+      <w:r>
+        <w:t xml:space="preserve">GRU1: 2 capas, 256 unidades, </w:t>
+      </w:r>
+      <w:proofErr w:type="spellStart"/>
+      <w:r>
+        <w:t>dropout</w:t>
+      </w:r>
+      <w:proofErr w:type="spellEnd"/>
+      <w:r>
+        <w:t xml:space="preserve"> 0.3</w:t>
+      </w:r>
+    </w:p>
+    <w:p>
+      <w:pPr>
+        <w:numPr>
+          <w:ilvl w:val="1"/>
+          <w:numId w:val="23"/>
+        </w:numPr>
+      </w:pPr>
+      <w:r>
+        <w:t xml:space="preserve">GRU2: 2 capas, 128 unidades, </w:t>
+      </w:r>
+      <w:proofErr w:type="spellStart"/>
+      <w:r>
+        <w:t>dropout</w:t>
+      </w:r>
+      <w:proofErr w:type="spellEnd"/>
+      <w:r>
+        <w:t xml:space="preserve"> 0.3</w:t>
+      </w:r>
+    </w:p>
+    <w:p>
+      <w:pPr>
+        <w:numPr>
+          <w:ilvl w:val="1"/>
+          <w:numId w:val="23"/>
+        </w:numPr>
+      </w:pPr>
+      <w:r>
+        <w:t>Capa lineal final: predice RUL (1 valor)</w:t>
+      </w:r>
+    </w:p>
+    <w:p>
+      <w:pPr>
+        <w:numPr>
+          <w:ilvl w:val="0"/>
+          <w:numId w:val="23"/>
+        </w:numPr>
+      </w:pPr>
+      <w:r>
+        <w:rPr>
+          <w:b/>
+          <w:bCs/>
+        </w:rPr>
+        <w:t>Motivación de la elección</w:t>
+      </w:r>
+      <w:r>
+        <w:t>:</w:t>
+      </w:r>
+    </w:p>
+    <w:p>
+      <w:pPr>
+        <w:numPr>
+          <w:ilvl w:val="1"/>
+          <w:numId w:val="24"/>
+        </w:numPr>
+      </w:pPr>
+      <w:r>
+        <w:t xml:space="preserve">Las series temporales de motores tienen </w:t>
+      </w:r>
+      <w:r>
+        <w:rPr>
+          <w:b/>
+          <w:bCs/>
+        </w:rPr>
+        <w:t>dependencias a largo plazo</w:t>
+      </w:r>
+      <w:r>
+        <w:t>.</w:t>
+      </w:r>
+    </w:p>
+    <w:p>
+      <w:pPr>
+        <w:numPr>
+          <w:ilvl w:val="1"/>
+          <w:numId w:val="24"/>
+        </w:numPr>
+      </w:pPr>
+      <w:r>
+        <w:t xml:space="preserve">GRU captura la dinámica temporal de los sensores con </w:t>
+      </w:r>
+      <w:r>
+        <w:rPr>
+          <w:b/>
+          <w:bCs/>
+        </w:rPr>
+        <w:t>menos parámetros que LSTM</w:t>
+      </w:r>
+      <w:r>
+        <w:t xml:space="preserve">, evitando sobreajuste en </w:t>
+      </w:r>
+      <w:proofErr w:type="spellStart"/>
+      <w:r>
+        <w:t>datasets</w:t>
+      </w:r>
+      <w:proofErr w:type="spellEnd"/>
+      <w:r>
+        <w:t xml:space="preserve"> moderados.</w:t>
+      </w:r>
+    </w:p>
+    <w:p>
+      <w:pPr>
+        <w:numPr>
+          <w:ilvl w:val="1"/>
+          <w:numId w:val="24"/>
+        </w:numPr>
+      </w:pPr>
+      <w:r>
+        <w:t xml:space="preserve">Permite entrenar de manera eficiente con </w:t>
+      </w:r>
+      <w:proofErr w:type="spellStart"/>
+      <w:r>
+        <w:t>GPUs</w:t>
+      </w:r>
+      <w:proofErr w:type="spellEnd"/>
+      <w:r>
+        <w:t>, facilitando ensambles de modelos.</w:t>
+      </w:r>
+    </w:p>
+    <w:p>
+      <w:pPr>
+        <w:numPr>
+          <w:ilvl w:val="0"/>
+          <w:numId w:val="23"/>
+        </w:numPr>
+      </w:pPr>
+      <w:r>
+        <w:rPr>
+          <w:b/>
+          <w:bCs/>
+        </w:rPr>
+        <w:t>Optimización</w:t>
+      </w:r>
+      <w:r>
+        <w:t>:</w:t>
+      </w:r>
+    </w:p>
+    <w:p>
+      <w:pPr>
+        <w:numPr>
+          <w:ilvl w:val="1"/>
+          <w:numId w:val="23"/>
+        </w:numPr>
+      </w:pPr>
+      <w:r>
+        <w:lastRenderedPageBreak/>
+        <w:t xml:space="preserve">Función de pérdida: </w:t>
+      </w:r>
+      <w:r>
+        <w:rPr>
+          <w:b/>
+          <w:bCs/>
+        </w:rPr>
+        <w:t xml:space="preserve">MSE (Mean </w:t>
+      </w:r>
+      <w:proofErr w:type="spellStart"/>
+      <w:r>
+        <w:rPr>
+          <w:b/>
+          <w:bCs/>
+        </w:rPr>
+        <w:t>Squared</w:t>
+      </w:r>
+      <w:proofErr w:type="spellEnd"/>
+      <w:r>
+        <w:rPr>
+          <w:b/>
+          <w:bCs/>
+        </w:rPr>
+        <w:t xml:space="preserve"> Error)</w:t>
+      </w:r>
+    </w:p>
+    <w:p>
+      <w:pPr>
+        <w:numPr>
+          <w:ilvl w:val="1"/>
+          <w:numId w:val="23"/>
+        </w:numPr>
+      </w:pPr>
+      <w:r>
+        <w:t xml:space="preserve">Optimizador: </w:t>
+      </w:r>
+      <w:r>
+        <w:rPr>
+          <w:b/>
+          <w:bCs/>
+        </w:rPr>
+        <w:t>Adam</w:t>
+      </w:r>
+      <w:r>
+        <w:t>, LR=0.0005</w:t>
+      </w:r>
+    </w:p>
+    <w:p>
+      <w:pPr>
+        <w:numPr>
+          <w:ilvl w:val="1"/>
+          <w:numId w:val="23"/>
+        </w:numPr>
+      </w:pPr>
+      <w:proofErr w:type="spellStart"/>
+      <w:r>
+        <w:t>Early</w:t>
+      </w:r>
+      <w:proofErr w:type="spellEnd"/>
+      <w:r>
+        <w:t xml:space="preserve"> </w:t>
+      </w:r>
+      <w:proofErr w:type="spellStart"/>
+      <w:r>
+        <w:t>stopping</w:t>
+      </w:r>
+      <w:proofErr w:type="spellEnd"/>
+      <w:r>
+        <w:t>: 30 épocas sin mejora en validación</w:t>
+      </w:r>
+    </w:p>
+    <w:p>
+      <w:r>
+        <w:rPr>
+          <w:b/>
+          <w:bCs/>
+        </w:rPr>
+        <w:t>Figura sugerida</w:t>
+      </w:r>
+      <w:r>
+        <w:t>: Diagrama de la arquitectura GRU y flujo de datos de entrada → ventanas → GRU → RUL.</w:t>
+      </w:r>
+    </w:p>
+    <w:p>
+      <w:r>
+        <w:pict w14:anchorId="72D36D42">
+          <v:rect id="_x0000_i1084" style="width:0;height:1.5pt" o:hralign="center" o:hrstd="t" o:hr="t" fillcolor="#a0a0a0" stroked="f"/>
+        </w:pict>
+      </w:r>
+    </w:p>
+    <w:p>
+      <w:pPr>
+        <w:rPr>
+          <w:b/>
+          <w:bCs/>
+        </w:rPr>
+      </w:pPr>
+      <w:r>
+        <w:rPr>
+          <w:b/>
+          <w:bCs/>
+        </w:rPr>
+        <w:t>4. Evaluación de resultados</w:t>
+      </w:r>
+    </w:p>
+    <w:p>
+      <w:r>
+        <w:t xml:space="preserve">Se entrenó y evaluó el modelo en los 4 </w:t>
+      </w:r>
+      <w:proofErr w:type="spellStart"/>
+      <w:r>
+        <w:t>datasets</w:t>
+      </w:r>
+      <w:proofErr w:type="spellEnd"/>
+      <w:r>
+        <w:t xml:space="preserve"> (FD001–FD004), obteniendo las siguientes métricas:</w:t>
+      </w:r>
+    </w:p>
+    <w:tbl>
+      <w:tblPr>
+        <w:tblW w:w="0" w:type="auto"/>
+        <w:tblCellSpacing w:w="15" w:type="dxa"/>
+        <w:tblCellMar>
+          <w:top w:w="15" w:type="dxa"/>
+          <w:left w:w="15" w:type="dxa"/>
+          <w:bottom w:w="15" w:type="dxa"/>
+          <w:right w:w="15" w:type="dxa"/>
+        </w:tblCellMar>
+        <w:tblLook w:val="04A0" w:firstRow="1" w:lastRow="0" w:firstColumn="1" w:lastColumn="0" w:noHBand="0" w:noVBand="1"/>
+      </w:tblPr>
+      <w:tblGrid>
+        <w:gridCol w:w="933"/>
+        <w:gridCol w:w="898"/>
+        <w:gridCol w:w="642"/>
+        <w:gridCol w:w="691"/>
+        <w:gridCol w:w="5340"/>
+      </w:tblGrid>
+      <w:tr>
+        <w:trPr>
+          <w:tblHeader/>
+          <w:tblCellSpacing w:w="15" w:type="dxa"/>
+        </w:trPr>
+        <w:tc>
+          <w:tcPr>
+            <w:tcW w:w="0" w:type="auto"/>
+            <w:vAlign w:val="center"/>
+            <w:hideMark/>
+          </w:tcPr>
+          <w:p>
+            <w:pPr>
+              <w:rPr>
+                <w:b/>
+                <w:bCs/>
+              </w:rPr>
+            </w:pPr>
+            <w:proofErr w:type="spellStart"/>
+            <w:r>
+              <w:rPr>
+                <w:b/>
+                <w:bCs/>
+              </w:rPr>
+              <w:t>Dataset</w:t>
+            </w:r>
+            <w:proofErr w:type="spellEnd"/>
+          </w:p>
+        </w:tc>
+        <w:tc>
+          <w:tcPr>
+            <w:tcW w:w="0" w:type="auto"/>
+            <w:vAlign w:val="center"/>
+            <w:hideMark/>
+          </w:tcPr>
+          <w:p>
+            <w:pPr>
+              <w:rPr>
+                <w:b/>
+                <w:bCs/>
+              </w:rPr>
+            </w:pPr>
+            <w:r>
+              <w:rPr>
+                <w:b/>
+                <w:bCs/>
+              </w:rPr>
+              <w:t>MSE</w:t>
+            </w:r>
+          </w:p>
+        </w:tc>
+        <w:tc>
+          <w:tcPr>
+            <w:tcW w:w="0" w:type="auto"/>
+            <w:vAlign w:val="center"/>
+            <w:hideMark/>
+          </w:tcPr>
+          <w:p>
+            <w:pPr>
+              <w:rPr>
+                <w:b/>
+                <w:bCs/>
+              </w:rPr>
+            </w:pPr>
+            <w:r>
+              <w:rPr>
+                <w:b/>
+                <w:bCs/>
+              </w:rPr>
+              <w:t>MAE</w:t>
+            </w:r>
+          </w:p>
+        </w:tc>
+        <w:tc>
+          <w:tcPr>
+            <w:tcW w:w="0" w:type="auto"/>
+            <w:vAlign w:val="center"/>
+            <w:hideMark/>
+          </w:tcPr>
+          <w:p>
+            <w:pPr>
+              <w:rPr>
+                <w:b/>
+                <w:bCs/>
+              </w:rPr>
+            </w:pPr>
+            <w:r>
+              <w:rPr>
+                <w:b/>
+                <w:bCs/>
+              </w:rPr>
+              <w:t>RMSE</w:t>
+            </w:r>
+          </w:p>
+        </w:tc>
+        <w:tc>
+          <w:tcPr>
+            <w:tcW w:w="0" w:type="auto"/>
+            <w:vAlign w:val="center"/>
+            <w:hideMark/>
+          </w:tcPr>
+          <w:p>
+            <w:pPr>
+              <w:rPr>
+                <w:b/>
+                <w:bCs/>
+              </w:rPr>
+            </w:pPr>
+            <w:r>
+              <w:rPr>
+                <w:b/>
+                <w:bCs/>
+              </w:rPr>
+              <w:t>Observaciones</w:t>
+            </w:r>
+          </w:p>
+        </w:tc>
+      </w:tr>
+      <w:tr>
+        <w:trPr>
+          <w:tblCellSpacing w:w="15" w:type="dxa"/>
+        </w:trPr>
+        <w:tc>
+          <w:tcPr>
+            <w:tcW w:w="0" w:type="auto"/>
+            <w:vAlign w:val="center"/>
+            <w:hideMark/>
+          </w:tcPr>
+          <w:p>
+            <w:r>
+              <w:t>FD001</w:t>
+            </w:r>
+          </w:p>
+        </w:tc>
+        <w:tc>
+          <w:tcPr>
+            <w:tcW w:w="0" w:type="auto"/>
+            <w:vAlign w:val="center"/>
+            <w:hideMark/>
+          </w:tcPr>
+          <w:p>
+            <w:r>
+              <w:t>418,75</w:t>
+            </w:r>
+          </w:p>
+        </w:tc>
+        <w:tc>
+          <w:tcPr>
+            <w:tcW w:w="0" w:type="auto"/>
+            <w:vAlign w:val="center"/>
+            <w:hideMark/>
+          </w:tcPr>
+          <w:p>
+            <w:r>
+              <w:t>15,49</w:t>
+            </w:r>
+          </w:p>
+        </w:tc>
+        <w:tc>
+          <w:tcPr>
+            <w:tcW w:w="0" w:type="auto"/>
+            <w:vAlign w:val="center"/>
+            <w:hideMark/>
+          </w:tcPr>
+          <w:p>
+            <w:r>
+              <w:t>20,46</w:t>
+            </w:r>
+          </w:p>
+        </w:tc>
+        <w:tc>
+          <w:tcPr>
+            <w:tcW w:w="0" w:type="auto"/>
+            <w:vAlign w:val="center"/>
+            <w:hideMark/>
+          </w:tcPr>
+          <w:p>
+            <w:proofErr w:type="spellStart"/>
+            <w:r>
+              <w:t>Dataset</w:t>
+            </w:r>
+            <w:proofErr w:type="spellEnd"/>
+            <w:r>
+              <w:t xml:space="preserve"> sencillo: 1 modo de fallo y 1 condición operativa → mejor desempeño</w:t>
+            </w:r>
+          </w:p>
+        </w:tc>
+      </w:tr>
+      <w:tr>
+        <w:trPr>
+          <w:tblCellSpacing w:w="15" w:type="dxa"/>
+        </w:trPr>
+        <w:tc>
+          <w:tcPr>
+            <w:tcW w:w="0" w:type="auto"/>
+            <w:vAlign w:val="center"/>
+            <w:hideMark/>
+          </w:tcPr>
+          <w:p>
+            <w:r>
+              <w:t>FD002</w:t>
+            </w:r>
+          </w:p>
+        </w:tc>
+        <w:tc>
+          <w:tcPr>
+            <w:tcW w:w="0" w:type="auto"/>
+            <w:vAlign w:val="center"/>
+            <w:hideMark/>
+          </w:tcPr>
+          <w:p>
+            <w:r>
+              <w:t>1114,93</w:t>
+            </w:r>
+          </w:p>
+        </w:tc>
+        <w:tc>
+          <w:tcPr>
+            <w:tcW w:w="0" w:type="auto"/>
+            <w:vAlign w:val="center"/>
+            <w:hideMark/>
+          </w:tcPr>
+          <w:p>
+            <w:r>
+              <w:t>23,77</w:t>
+            </w:r>
+          </w:p>
+        </w:tc>
+        <w:tc>
+          <w:tcPr>
+            <w:tcW w:w="0" w:type="auto"/>
+            <w:vAlign w:val="center"/>
+            <w:hideMark/>
+          </w:tcPr>
+          <w:p>
+            <w:r>
+              <w:t>33,39</w:t>
+            </w:r>
+          </w:p>
+        </w:tc>
+        <w:tc>
+          <w:tcPr>
+            <w:tcW w:w="0" w:type="auto"/>
+            <w:vAlign w:val="center"/>
+            <w:hideMark/>
+          </w:tcPr>
+          <w:p>
+            <w:r>
+              <w:t>Mayor variabilidad: 6 condiciones operativas → error aumenta</w:t>
+            </w:r>
+          </w:p>
+        </w:tc>
+      </w:tr>
+      <w:tr>
+        <w:trPr>
+          <w:tblCellSpacing w:w="15" w:type="dxa"/>
+        </w:trPr>
+        <w:tc>
+          <w:tcPr>
+            <w:tcW w:w="0" w:type="auto"/>
+            <w:vAlign w:val="center"/>
+            <w:hideMark/>
+          </w:tcPr>
+          <w:p>
+            <w:r>
+              <w:t>FD003</w:t>
+            </w:r>
+          </w:p>
+        </w:tc>
+        <w:tc>
+          <w:tcPr>
+            <w:tcW w:w="0" w:type="auto"/>
+            <w:vAlign w:val="center"/>
+            <w:hideMark/>
+          </w:tcPr>
+          <w:p>
+            <w:r>
+              <w:t>2104,09</w:t>
+            </w:r>
+          </w:p>
+        </w:tc>
+        <w:tc>
+          <w:tcPr>
+            <w:tcW w:w="0" w:type="auto"/>
+            <w:vAlign w:val="center"/>
+            <w:hideMark/>
+          </w:tcPr>
+          <w:p>
+            <w:r>
+              <w:t>27,19</w:t>
+            </w:r>
+          </w:p>
+        </w:tc>
+        <w:tc>
+          <w:tcPr>
+            <w:tcW w:w="0" w:type="auto"/>
+            <w:vAlign w:val="center"/>
+            <w:hideMark/>
+          </w:tcPr>
+          <w:p>
+            <w:r>
+              <w:t>45,87</w:t>
+            </w:r>
+          </w:p>
+        </w:tc>
+        <w:tc>
+          <w:tcPr>
+            <w:tcW w:w="0" w:type="auto"/>
+            <w:vAlign w:val="center"/>
+            <w:hideMark/>
+          </w:tcPr>
+          <w:p>
+            <w:r>
+              <w:t>Dos modos de fallo (HPC + Fan) → incremento de la complejidad</w:t>
+            </w:r>
+          </w:p>
+        </w:tc>
+      </w:tr>
+      <w:tr>
+        <w:trPr>
+          <w:tblCellSpacing w:w="15" w:type="dxa"/>
+        </w:trPr>
+        <w:tc>
+          <w:tcPr>
+            <w:tcW w:w="0" w:type="auto"/>
+            <w:vAlign w:val="center"/>
+            <w:hideMark/>
+          </w:tcPr>
+          <w:p>
+            <w:r>
+              <w:t>FD004</w:t>
+            </w:r>
+          </w:p>
+        </w:tc>
+        <w:tc>
+          <w:tcPr>
+            <w:tcW w:w="0" w:type="auto"/>
+            <w:vAlign w:val="center"/>
+            <w:hideMark/>
+          </w:tcPr>
+          <w:p>
+            <w:r>
+              <w:t>1842,54</w:t>
+            </w:r>
+          </w:p>
+        </w:tc>
+        <w:tc>
+          <w:tcPr>
+            <w:tcW w:w="0" w:type="auto"/>
+            <w:vAlign w:val="center"/>
+            <w:hideMark/>
+          </w:tcPr>
+          <w:p>
+            <w:r>
+              <w:t>31,80</w:t>
+            </w:r>
+          </w:p>
+        </w:tc>
+        <w:tc>
+          <w:tcPr>
+            <w:tcW w:w="0" w:type="auto"/>
+            <w:vAlign w:val="center"/>
+            <w:hideMark/>
+          </w:tcPr>
+          <w:p>
+            <w:r>
+              <w:t>42,92</w:t>
+            </w:r>
+          </w:p>
+        </w:tc>
+        <w:tc>
+          <w:tcPr>
+            <w:tcW w:w="0" w:type="auto"/>
+            <w:vAlign w:val="center"/>
+            <w:hideMark/>
+          </w:tcPr>
+          <w:p>
+            <w:r>
+              <w:t>Dos modos de fallo y 6 condiciones → error elevado</w:t>
+            </w:r>
+          </w:p>
+        </w:tc>
+      </w:tr>
+    </w:tbl>
+    <w:p>
+      <w:r>
+        <w:rPr>
+          <w:b/>
+          <w:bCs/>
+        </w:rPr>
+        <w:t>Interpretación académica</w:t>
+      </w:r>
+      <w:r>
+        <w:t>:</w:t>
+      </w:r>
+    </w:p>
+    <w:p>
+      <w:pPr>
+        <w:numPr>
+          <w:ilvl w:val="0"/>
+          <w:numId w:val="25"/>
+        </w:numPr>
+      </w:pPr>
+      <w:r>
+        <w:rPr>
+          <w:b/>
+          <w:bCs/>
+        </w:rPr>
+        <w:t xml:space="preserve">MSE (Mean </w:t>
+      </w:r>
+      <w:proofErr w:type="spellStart"/>
+      <w:r>
+        <w:rPr>
+          <w:b/>
+          <w:bCs/>
+        </w:rPr>
+        <w:t>Squared</w:t>
+      </w:r>
+      <w:proofErr w:type="spellEnd"/>
+      <w:r>
+        <w:rPr>
+          <w:b/>
+          <w:bCs/>
+        </w:rPr>
+        <w:t xml:space="preserve"> Error)</w:t>
+      </w:r>
+      <w:r>
+        <w:t>: Penaliza fuertemente los errores grandes. Su aumento en FD003 y FD004 indica que los motores con múltiples modos de fallo son más difíciles de predecir.</w:t>
+      </w:r>
+    </w:p>
+    <w:p>
+      <w:pPr>
+        <w:numPr>
+          <w:ilvl w:val="0"/>
+          <w:numId w:val="25"/>
+        </w:numPr>
+      </w:pPr>
+      <w:r>
+        <w:rPr>
+          <w:b/>
+          <w:bCs/>
+        </w:rPr>
+        <w:t>MAE (Mean Absolute Error)</w:t>
+      </w:r>
+      <w:r>
+        <w:t xml:space="preserve">: Promedio de errores absolutos. Refleja precisión general, menos sensible a </w:t>
+      </w:r>
+      <w:proofErr w:type="spellStart"/>
+      <w:r>
+        <w:t>outliers</w:t>
+      </w:r>
+      <w:proofErr w:type="spellEnd"/>
+      <w:r>
+        <w:t xml:space="preserve"> que MSE.</w:t>
+      </w:r>
+    </w:p>
+    <w:p>
+      <w:pPr>
+        <w:numPr>
+          <w:ilvl w:val="0"/>
+          <w:numId w:val="25"/>
+        </w:numPr>
+      </w:pPr>
+      <w:r>
+        <w:rPr>
+          <w:b/>
+          <w:bCs/>
+        </w:rPr>
+        <w:t>RMSE (</w:t>
+      </w:r>
+      <w:proofErr w:type="spellStart"/>
+      <w:r>
+        <w:rPr>
+          <w:b/>
+          <w:bCs/>
+        </w:rPr>
+        <w:t>Root</w:t>
+      </w:r>
+      <w:proofErr w:type="spellEnd"/>
+      <w:r>
+        <w:rPr>
+          <w:b/>
+          <w:bCs/>
+        </w:rPr>
+        <w:t xml:space="preserve"> MSE)</w:t>
+      </w:r>
+      <w:r>
+        <w:t>: Raíz cuadrada del MSE; en las mismas unidades que la RUL. Permite comparar directamente la magnitud del error con los ciclos restantes.</w:t>
+      </w:r>
+    </w:p>
+    <w:p>
+      <w:r>
+        <w:rPr>
+          <w:b/>
+          <w:bCs/>
+        </w:rPr>
+        <w:t>Observación</w:t>
+      </w:r>
+      <w:r>
+        <w:t xml:space="preserve">: El comportamiento del modelo es consistente con la complejidad del </w:t>
+      </w:r>
+      <w:proofErr w:type="spellStart"/>
+      <w:r>
+        <w:t>dataset</w:t>
+      </w:r>
+      <w:proofErr w:type="spellEnd"/>
+      <w:r>
+        <w:t xml:space="preserve">: mientras más modos de fallo y condiciones, mayor error, lo que justifica la necesidad de </w:t>
+      </w:r>
+      <w:r>
+        <w:rPr>
+          <w:b/>
+          <w:bCs/>
+        </w:rPr>
+        <w:t>modelos robustos o ensambles</w:t>
+      </w:r>
+      <w:r>
+        <w:t xml:space="preserve"> para FD003 y FD004.</w:t>
+      </w:r>
+    </w:p>
+    <w:p>
+      <w:r>
+        <w:rPr>
+          <w:b/>
+          <w:bCs/>
+        </w:rPr>
+        <w:t>Figura sugerida</w:t>
+      </w:r>
+      <w:r>
+        <w:t>: Gráficas de RUL real vs predicho para FD001–FD004.</w:t>
+      </w:r>
+    </w:p>
+    <w:p>
+      <w:r>
+        <w:pict w14:anchorId="3413644E">
+          <v:rect id="_x0000_i1085" style="width:0;height:1.5pt" o:hralign="center" o:hrstd="t" o:hr="t" fillcolor="#a0a0a0" stroked="f"/>
+        </w:pict>
+      </w:r>
+    </w:p>
+    <w:p>
+      <w:pPr>
+        <w:rPr>
+          <w:b/>
+          <w:bCs/>
+        </w:rPr>
+      </w:pPr>
+      <w:r>
+        <w:rPr>
+          <w:b/>
+          <w:bCs/>
+        </w:rPr>
+        <w:lastRenderedPageBreak/>
+        <w:t>5. Interpretación aeronáutica y modos de fallo</w:t>
+      </w:r>
+    </w:p>
+    <w:p>
+      <w:r>
+        <w:t>El módulo no solo predice RUL, sino que también interpreta:</w:t>
+      </w:r>
+    </w:p>
+    <w:p>
+      <w:pPr>
+        <w:numPr>
+          <w:ilvl w:val="0"/>
+          <w:numId w:val="26"/>
+        </w:numPr>
+      </w:pPr>
+      <w:r>
+        <w:rPr>
+          <w:b/>
+          <w:bCs/>
+        </w:rPr>
+        <w:t>RUL &gt; 80</w:t>
+      </w:r>
+      <w:r>
+        <w:t>: Desgaste bajo → operación normal</w:t>
+      </w:r>
+    </w:p>
+    <w:p>
+      <w:pPr>
+        <w:numPr>
+          <w:ilvl w:val="0"/>
+          <w:numId w:val="26"/>
+        </w:numPr>
+      </w:pPr>
+      <w:r>
+        <w:rPr>
+          <w:b/>
+          <w:bCs/>
+        </w:rPr>
+        <w:t>RUL 41–80</w:t>
+      </w:r>
+      <w:r>
+        <w:t>: Desgaste moderado → inspección preventiva</w:t>
+      </w:r>
+    </w:p>
+    <w:p>
+      <w:pPr>
+        <w:numPr>
+          <w:ilvl w:val="0"/>
+          <w:numId w:val="26"/>
+        </w:numPr>
+      </w:pPr>
+      <w:r>
+        <w:rPr>
+          <w:b/>
+          <w:bCs/>
+        </w:rPr>
+        <w:t>RUL 21–40</w:t>
+      </w:r>
+      <w:r>
+        <w:t>: Desgaste significativo → inspección avanzada</w:t>
+      </w:r>
+    </w:p>
+    <w:p>
+      <w:pPr>
+        <w:numPr>
+          <w:ilvl w:val="0"/>
+          <w:numId w:val="26"/>
+        </w:numPr>
+      </w:pPr>
+      <w:r>
+        <w:rPr>
+          <w:b/>
+          <w:bCs/>
+        </w:rPr>
+        <w:t>RUL 6–20</w:t>
+      </w:r>
+      <w:r>
+        <w:t>: Riesgo elevado → monitorización constante</w:t>
+      </w:r>
+    </w:p>
+    <w:p>
+      <w:pPr>
+        <w:numPr>
+          <w:ilvl w:val="0"/>
+          <w:numId w:val="26"/>
+        </w:numPr>
+      </w:pPr>
+      <w:r>
+        <w:rPr>
+          <w:b/>
+          <w:bCs/>
+        </w:rPr>
+        <w:t>RUL ≤5</w:t>
+      </w:r>
+      <w:r>
+        <w:t>: ALERTA CRÍTICA → retirar motor</w:t>
+      </w:r>
+    </w:p>
+    <w:p>
+      <w:r>
+        <w:rPr>
+          <w:b/>
+          <w:bCs/>
+        </w:rPr>
+        <w:t>Modos de fallo detectables:</w:t>
+      </w:r>
+    </w:p>
+    <w:p>
+      <w:pPr>
+        <w:numPr>
+          <w:ilvl w:val="0"/>
+          <w:numId w:val="27"/>
+        </w:numPr>
+      </w:pPr>
+      <w:r>
+        <w:rPr>
+          <w:b/>
+          <w:bCs/>
+        </w:rPr>
+        <w:t xml:space="preserve">HPC </w:t>
+      </w:r>
+      <w:proofErr w:type="spellStart"/>
+      <w:r>
+        <w:rPr>
+          <w:b/>
+          <w:bCs/>
+        </w:rPr>
+        <w:t>Degradation</w:t>
+      </w:r>
+      <w:proofErr w:type="spellEnd"/>
+      <w:r>
+        <w:t>: Pérdida de eficiencia en el compresor de alta presión</w:t>
+      </w:r>
+    </w:p>
+    <w:p>
+      <w:pPr>
+        <w:numPr>
+          <w:ilvl w:val="0"/>
+          <w:numId w:val="27"/>
+        </w:numPr>
+      </w:pPr>
+      <w:r>
+        <w:rPr>
+          <w:b/>
+          <w:bCs/>
+        </w:rPr>
+        <w:t xml:space="preserve">Fan </w:t>
+      </w:r>
+      <w:proofErr w:type="spellStart"/>
+      <w:r>
+        <w:rPr>
+          <w:b/>
+          <w:bCs/>
+        </w:rPr>
+        <w:t>Degradation</w:t>
+      </w:r>
+      <w:proofErr w:type="spellEnd"/>
+      <w:r>
+        <w:t>: Fallo o desgaste del fan frontal</w:t>
+      </w:r>
+    </w:p>
+    <w:p>
+      <w:pPr>
+        <w:numPr>
+          <w:ilvl w:val="0"/>
+          <w:numId w:val="27"/>
+        </w:numPr>
+      </w:pPr>
+      <w:r>
+        <w:t>La combinación de sensores permite inferir cuál es el modo de fallo más probable.</w:t>
+      </w:r>
+    </w:p>
+    <w:p>
+      <w:r>
+        <w:rPr>
+          <w:b/>
+          <w:bCs/>
+        </w:rPr>
+        <w:t>Tabla sugerida</w:t>
+      </w:r>
+      <w:r>
+        <w:t>: Modos de fallo y sensores asociados.</w:t>
+      </w:r>
+    </w:p>
+    <w:p>
+      <w:r>
+        <w:pict w14:anchorId="66FBCA64">
+          <v:rect id="_x0000_i1086" style="width:0;height:1.5pt" o:hralign="center" o:hrstd="t" o:hr="t" fillcolor="#a0a0a0" stroked="f"/>
+        </w:pict>
+      </w:r>
+    </w:p>
+    <w:p>
+      <w:pPr>
+        <w:rPr>
+          <w:b/>
+          <w:bCs/>
+        </w:rPr>
+      </w:pPr>
+      <w:r>
+        <w:rPr>
+          <w:b/>
+          <w:bCs/>
+        </w:rPr>
+        <w:t>6. Limitaciones</w:t>
+      </w:r>
+    </w:p>
+    <w:p>
+      <w:pPr>
+        <w:numPr>
+          <w:ilvl w:val="0"/>
+          <w:numId w:val="28"/>
+        </w:numPr>
+      </w:pPr>
+      <w:r>
+        <w:t>Sensores seleccionados: solo un subconjunto (s_1–s_21) → puede perder información de degradaciones menores.</w:t>
+      </w:r>
+    </w:p>
+    <w:p>
+      <w:pPr>
+        <w:numPr>
+          <w:ilvl w:val="0"/>
+          <w:numId w:val="28"/>
+        </w:numPr>
+      </w:pPr>
+      <w:r>
+        <w:t>La predicción es más confiable en condiciones similares a las de entrenamiento.</w:t>
+      </w:r>
+    </w:p>
+    <w:p>
+      <w:pPr>
+        <w:numPr>
+          <w:ilvl w:val="0"/>
+          <w:numId w:val="28"/>
+        </w:numPr>
+      </w:pPr>
+      <w:r>
+        <w:t>Interpretación de modos de fallo es probabilística.</w:t>
+      </w:r>
+    </w:p>
+    <w:p>
+      <w:pPr>
+        <w:numPr>
+          <w:ilvl w:val="0"/>
+          <w:numId w:val="28"/>
+        </w:numPr>
+      </w:pPr>
+      <w:proofErr w:type="spellStart"/>
+      <w:r>
+        <w:t>Dataset</w:t>
+      </w:r>
+      <w:proofErr w:type="spellEnd"/>
+      <w:r>
+        <w:t xml:space="preserve"> sintético: aunque refleja física real, puede diferir de motores en campo.</w:t>
+      </w:r>
+    </w:p>
+    <w:p>
+      <w:r>
+        <w:pict w14:anchorId="64905829">
+          <v:rect id="_x0000_i1087" style="width:0;height:1.5pt" o:hralign="center" o:hrstd="t" o:hr="t" fillcolor="#a0a0a0" stroked="f"/>
+        </w:pict>
+      </w:r>
+    </w:p>
+    <w:p>
+      <w:pPr>
+        <w:rPr>
+          <w:b/>
+          <w:bCs/>
+        </w:rPr>
+      </w:pPr>
+      <w:r>
+        <w:rPr>
+          <w:b/>
+          <w:bCs/>
+        </w:rPr>
+        <w:t>7. Conclusión</w:t>
+      </w:r>
+    </w:p>
+    <w:p>
+      <w:r>
+        <w:t>El módulo CMAPSS permite:</w:t>
+      </w:r>
+    </w:p>
+    <w:p>
+      <w:pPr>
+        <w:numPr>
+          <w:ilvl w:val="0"/>
+          <w:numId w:val="29"/>
+        </w:numPr>
+      </w:pPr>
+      <w:r>
+        <w:t xml:space="preserve">Predicción de </w:t>
+      </w:r>
+      <w:r>
+        <w:rPr>
+          <w:b/>
+          <w:bCs/>
+        </w:rPr>
+        <w:t>RUL</w:t>
+      </w:r>
+      <w:r>
+        <w:t xml:space="preserve"> con GRU para motores simulados.</w:t>
+      </w:r>
+    </w:p>
+    <w:p>
+      <w:pPr>
+        <w:numPr>
+          <w:ilvl w:val="0"/>
+          <w:numId w:val="29"/>
+        </w:numPr>
+      </w:pPr>
+      <w:r>
+        <w:t xml:space="preserve">Identificación de </w:t>
+      </w:r>
+      <w:r>
+        <w:rPr>
+          <w:b/>
+          <w:bCs/>
+        </w:rPr>
+        <w:t>modos de fallo</w:t>
+      </w:r>
+      <w:r>
+        <w:t xml:space="preserve"> (HPC/Fan).</w:t>
+      </w:r>
+    </w:p>
+    <w:p>
+      <w:pPr>
+        <w:numPr>
+          <w:ilvl w:val="0"/>
+          <w:numId w:val="29"/>
+        </w:numPr>
+      </w:pPr>
+      <w:r>
+        <w:t xml:space="preserve">Interpretación clara para </w:t>
+      </w:r>
+      <w:r>
+        <w:rPr>
+          <w:b/>
+          <w:bCs/>
+        </w:rPr>
+        <w:t>mantenimiento predictivo</w:t>
+      </w:r>
+      <w:r>
+        <w:t>.</w:t>
+      </w:r>
+    </w:p>
+    <w:p>
+      <w:pPr>
+        <w:numPr>
+          <w:ilvl w:val="0"/>
+          <w:numId w:val="29"/>
+        </w:numPr>
+      </w:pPr>
+      <w:r>
+        <w:t xml:space="preserve">Evaluación cuantitativa del rendimiento mediante </w:t>
+      </w:r>
+      <w:r>
+        <w:rPr>
+          <w:b/>
+          <w:bCs/>
+        </w:rPr>
+        <w:t>MSE, MAE y RMSE</w:t>
+      </w:r>
+      <w:r>
+        <w:t xml:space="preserve">, mostrando cómo la complejidad del </w:t>
+      </w:r>
+      <w:proofErr w:type="spellStart"/>
+      <w:r>
+        <w:t>dataset</w:t>
+      </w:r>
+      <w:proofErr w:type="spellEnd"/>
+      <w:r>
+        <w:t xml:space="preserve"> impacta la precisión.</w:t>
+      </w:r>
+    </w:p>
+    <w:p>
+      <w:r>
+        <w:rPr>
+          <w:b/>
+          <w:bCs/>
+        </w:rPr>
+        <w:lastRenderedPageBreak/>
+        <w:t>Insertar figura</w:t>
+      </w:r>
+      <w:r>
+        <w:t xml:space="preserve">: Resumen gráfico de errores y predicciones para los 4 </w:t>
+      </w:r>
+      <w:proofErr w:type="spellStart"/>
+      <w:r>
+        <w:t>datasets</w:t>
+      </w:r>
+      <w:proofErr w:type="spellEnd"/>
+      <w:r>
+        <w:t>.</w:t>
+      </w:r>
+    </w:p>
+    <w:p>
+      <w:r>
+        <w:rPr>
+          <w:b/>
+          <w:bCs/>
+        </w:rPr>
+        <w:t>Comentario académico final</w:t>
+      </w:r>
+      <w:r>
+        <w:t xml:space="preserve">: La selección del GRU se justifica por su capacidad de capturar dependencias temporales en series multivariantes, su eficiencia computacional y su estabilidad en </w:t>
+      </w:r>
+      <w:proofErr w:type="spellStart"/>
+      <w:r>
+        <w:t>datasets</w:t>
+      </w:r>
+      <w:proofErr w:type="spellEnd"/>
+      <w:r>
+        <w:t xml:space="preserve"> con múltiples motores y modos de fallo. El análisis de errores muestra que los conjuntos con más modos de fallo y condiciones requieren estrategias de </w:t>
+      </w:r>
+      <w:r>
+        <w:rPr>
+          <w:b/>
+          <w:bCs/>
+        </w:rPr>
+        <w:t>ensamble o modelos híbridos</w:t>
+      </w:r>
+      <w:r>
+        <w:t xml:space="preserve"> para mejorar precisión futura.</w:t>
+      </w:r>
+    </w:p>
+    <w:p>
+      <w:r>
+        <w:pict w14:anchorId="10930413">
+          <v:rect id="_x0000_i1088" style="width:0;height:1.5pt" o:hralign="center" o:hrstd="t" o:hr="t" fillcolor="#a0a0a0" stroked="f"/>
+        </w:pict>
+      </w:r>
+    </w:p>
+    <w:p>
+      <w:r>
+        <w:t xml:space="preserve">Si quieres, David, puedo hacer </w:t>
+      </w:r>
+      <w:r>
+        <w:rPr>
+          <w:b/>
+          <w:bCs/>
+        </w:rPr>
+        <w:t>una versión con figuras simuladas y códigos de Python para generar todas las gráficas y tablas automáticamente</w:t>
+      </w:r>
+      <w:r>
+        <w:t xml:space="preserve">, lista para insertar directamente en tu TFM y </w:t>
+      </w:r>
+      <w:proofErr w:type="spellStart"/>
+      <w:r>
+        <w:t>Jupyter</w:t>
+      </w:r>
+      <w:proofErr w:type="spellEnd"/>
+      <w:r>
+        <w:t xml:space="preserve"> Notebook. Esto incluiría:</w:t>
+      </w:r>
+    </w:p>
+    <w:p>
+      <w:pPr>
+        <w:numPr>
+          <w:ilvl w:val="0"/>
+          <w:numId w:val="30"/>
+        </w:numPr>
+      </w:pPr>
+      <w:r>
+        <w:t>Curvas de entrenamiento (</w:t>
+      </w:r>
+      <w:proofErr w:type="spellStart"/>
+      <w:r>
+        <w:t>loss</w:t>
+      </w:r>
+      <w:proofErr w:type="spellEnd"/>
+      <w:r>
+        <w:t>)</w:t>
+      </w:r>
+    </w:p>
+    <w:p>
+      <w:pPr>
+        <w:numPr>
+          <w:ilvl w:val="0"/>
+          <w:numId w:val="30"/>
+        </w:numPr>
+      </w:pPr>
+      <w:r>
+        <w:t>RUL real vs predicho</w:t>
+      </w:r>
+    </w:p>
+    <w:p>
+      <w:pPr>
+        <w:numPr>
+          <w:ilvl w:val="0"/>
+          <w:numId w:val="30"/>
+        </w:numPr>
+      </w:pPr>
+      <w:r>
+        <w:t>Comparación de errores entre FD001–FD004</w:t>
+      </w:r>
+    </w:p>
+    <w:p>
+      <w:pPr>
+        <w:numPr>
+          <w:ilvl w:val="0"/>
+          <w:numId w:val="30"/>
+        </w:numPr>
+      </w:pPr>
+      <w:r>
+        <w:t>Tabla de interpretación de modos de fallo</w:t>
+      </w:r>
+    </w:p>
+    <w:p>
+      <w:r>
+        <w:t>¿Quieres que haga esa versión completa con código y gráficas?</w:t>
       </w:r>
     </w:p>
     <w:p/>
@@ -1706,6 +4254,236 @@
 <file path=word/numbering.xml><?xml version="1.0" encoding="utf-8"?>
 <w:numbering xmlns:wpc="http://schemas.microsoft.com/office/word/2010/wordprocessingCanvas" xmlns:cx="http://schemas.microsoft.com/office/drawing/2014/chartex" xmlns:cx1="http://schemas.microsoft.com/office/drawing/2015/9/8/chartex" xmlns:cx2="http://schemas.microsoft.com/office/drawing/2015/10/21/chartex" xmlns:cx3="http://schemas.microsoft.com/office/drawing/2016/5/9/chartex" xmlns:cx4="http://schemas.microsoft.com/office/drawing/2016/5/10/chartex" xmlns:cx5="http://schemas.microsoft.com/office/drawing/2016/5/11/chartex" xmlns:cx6="http://schemas.microsoft.com/office/drawing/2016/5/12/chartex" xmlns:cx7="http://schemas.microsoft.com/office/drawing/2016/5/13/chartex" xmlns:cx8="http://schemas.microsoft.com/office/drawing/2016/5/14/chartex" xmlns:mc="http://schemas.openxmlformats.org/markup-compatibility/2006" xmlns:aink="http://schemas.microsoft.com/office/drawing/2016/ink" xmlns:am3d="http://schemas.microsoft.com/office/drawing/2017/model3d" xmlns:o="urn:schemas-microsoft-com:office:office" xmlns:oel="http://schemas.microsoft.com/office/2019/extlst" xmlns:r="http://schemas.openxmlformats.org/officeDocument/2006/relationships" xmlns:m="http://schemas.openxmlformats.org/officeDocument/2006/math" xmlns:v="urn:schemas-microsoft-com:vml" xmlns:wp14="http://schemas.microsoft.com/office/word/2010/wordprocessingDrawing" xmlns:wp="http://schemas.openxmlformats.org/drawingml/2006/wordprocessingDrawing" xmlns:w10="urn:schemas-microsoft-com:office:word" xmlns:w="http://schemas.openxmlformats.org/wordprocessingml/2006/main" xmlns:w14="http://schemas.microsoft.com/office/word/2010/wordml" xmlns:w15="http://schemas.microsoft.com/office/word/2012/wordml" xmlns:w16cex="http://schemas.microsoft.com/office/word/2018/wordml/cex" xmlns:w16cid="http://schemas.microsoft.com/office/word/2016/wordml/cid" xmlns:w16="http://schemas.microsoft.com/office/word/2018/wordml" xmlns:w16du="http://schemas.microsoft.com/office/word/2023/wordml/word16du" xmlns:w16sdtdh="http://schemas.microsoft.com/office/word/2020/wordml/sdtdatahash" xmlns:w16sdtfl="http://schemas.microsoft.com/office/word/2024/wordml/sdtformatlock" xmlns:w16se="http://schemas.microsoft.com/office/word/2015/wordml/symex" xmlns:wpg="http://schemas.microsoft.com/office/word/2010/wordprocessingGroup" xmlns:wpi="http://schemas.microsoft.com/office/word/2010/wordprocessingInk" xmlns:wne="http://schemas.microsoft.com/office/word/2006/wordml" xmlns:wps="http://schemas.microsoft.com/office/word/2010/wordprocessingShape" mc:Ignorable="w14 w15 w16se w16cid w16 w16cex w16sdtdh w16sdtfl w16du wp14">
   <w:abstractNum w:abstractNumId="0" w15:restartNumberingAfterBreak="0">
+    <w:nsid w:val="042D7224"/>
+    <w:multiLevelType w:val="multilevel"/>
+    <w:tmpl w:val="2F94C166"/>
+    <w:lvl w:ilvl="0">
+      <w:start w:val="1"/>
+      <w:numFmt w:val="decimal"/>
+      <w:lvlText w:val="%1."/>
+      <w:lvlJc w:val="left"/>
+      <w:pPr>
+        <w:tabs>
+          <w:tab w:val="num" w:pos="720"/>
+        </w:tabs>
+        <w:ind w:left="720" w:hanging="360"/>
+      </w:pPr>
+    </w:lvl>
+    <w:lvl w:ilvl="1" w:tentative="1">
+      <w:start w:val="1"/>
+      <w:numFmt w:val="decimal"/>
+      <w:lvlText w:val="%2."/>
+      <w:lvlJc w:val="left"/>
+      <w:pPr>
+        <w:tabs>
+          <w:tab w:val="num" w:pos="1440"/>
+        </w:tabs>
+        <w:ind w:left="1440" w:hanging="360"/>
+      </w:pPr>
+    </w:lvl>
+    <w:lvl w:ilvl="2" w:tentative="1">
+      <w:start w:val="1"/>
+      <w:numFmt w:val="decimal"/>
+      <w:lvlText w:val="%3."/>
+      <w:lvlJc w:val="left"/>
+      <w:pPr>
+        <w:tabs>
+          <w:tab w:val="num" w:pos="2160"/>
+        </w:tabs>
+        <w:ind w:left="2160" w:hanging="360"/>
+      </w:pPr>
+    </w:lvl>
+    <w:lvl w:ilvl="3" w:tentative="1">
+      <w:start w:val="1"/>
+      <w:numFmt w:val="decimal"/>
+      <w:lvlText w:val="%4."/>
+      <w:lvlJc w:val="left"/>
+      <w:pPr>
+        <w:tabs>
+          <w:tab w:val="num" w:pos="2880"/>
+        </w:tabs>
+        <w:ind w:left="2880" w:hanging="360"/>
+      </w:pPr>
+    </w:lvl>
+    <w:lvl w:ilvl="4" w:tentative="1">
+      <w:start w:val="1"/>
+      <w:numFmt w:val="decimal"/>
+      <w:lvlText w:val="%5."/>
+      <w:lvlJc w:val="left"/>
+      <w:pPr>
+        <w:tabs>
+          <w:tab w:val="num" w:pos="3600"/>
+        </w:tabs>
+        <w:ind w:left="3600" w:hanging="360"/>
+      </w:pPr>
+    </w:lvl>
+    <w:lvl w:ilvl="5" w:tentative="1">
+      <w:start w:val="1"/>
+      <w:numFmt w:val="decimal"/>
+      <w:lvlText w:val="%6."/>
+      <w:lvlJc w:val="left"/>
+      <w:pPr>
+        <w:tabs>
+          <w:tab w:val="num" w:pos="4320"/>
+        </w:tabs>
+        <w:ind w:left="4320" w:hanging="360"/>
+      </w:pPr>
+    </w:lvl>
+    <w:lvl w:ilvl="6" w:tentative="1">
+      <w:start w:val="1"/>
+      <w:numFmt w:val="decimal"/>
+      <w:lvlText w:val="%7."/>
+      <w:lvlJc w:val="left"/>
+      <w:pPr>
+        <w:tabs>
+          <w:tab w:val="num" w:pos="5040"/>
+        </w:tabs>
+        <w:ind w:left="5040" w:hanging="360"/>
+      </w:pPr>
+    </w:lvl>
+    <w:lvl w:ilvl="7" w:tentative="1">
+      <w:start w:val="1"/>
+      <w:numFmt w:val="decimal"/>
+      <w:lvlText w:val="%8."/>
+      <w:lvlJc w:val="left"/>
+      <w:pPr>
+        <w:tabs>
+          <w:tab w:val="num" w:pos="5760"/>
+        </w:tabs>
+        <w:ind w:left="5760" w:hanging="360"/>
+      </w:pPr>
+    </w:lvl>
+    <w:lvl w:ilvl="8" w:tentative="1">
+      <w:start w:val="1"/>
+      <w:numFmt w:val="decimal"/>
+      <w:lvlText w:val="%9."/>
+      <w:lvlJc w:val="left"/>
+      <w:pPr>
+        <w:tabs>
+          <w:tab w:val="num" w:pos="6480"/>
+        </w:tabs>
+        <w:ind w:left="6480" w:hanging="360"/>
+      </w:pPr>
+    </w:lvl>
+  </w:abstractNum>
+  <w:abstractNum w:abstractNumId="1" w15:restartNumberingAfterBreak="0">
+    <w:nsid w:val="04FC56A2"/>
+    <w:multiLevelType w:val="multilevel"/>
+    <w:tmpl w:val="755E2014"/>
+    <w:lvl w:ilvl="0">
+      <w:start w:val="1"/>
+      <w:numFmt w:val="decimal"/>
+      <w:lvlText w:val="%1."/>
+      <w:lvlJc w:val="left"/>
+      <w:pPr>
+        <w:tabs>
+          <w:tab w:val="num" w:pos="720"/>
+        </w:tabs>
+        <w:ind w:left="720" w:hanging="360"/>
+      </w:pPr>
+    </w:lvl>
+    <w:lvl w:ilvl="1">
+      <w:start w:val="1"/>
+      <w:numFmt w:val="bullet"/>
+      <w:lvlText w:val="o"/>
+      <w:lvlJc w:val="left"/>
+      <w:pPr>
+        <w:tabs>
+          <w:tab w:val="num" w:pos="1440"/>
+        </w:tabs>
+        <w:ind w:left="1440" w:hanging="360"/>
+      </w:pPr>
+      <w:rPr>
+        <w:rFonts w:ascii="Courier New" w:hAnsi="Courier New" w:hint="default"/>
+        <w:sz w:val="20"/>
+      </w:rPr>
+    </w:lvl>
+    <w:lvl w:ilvl="2" w:tentative="1">
+      <w:start w:val="1"/>
+      <w:numFmt w:val="decimal"/>
+      <w:lvlText w:val="%3."/>
+      <w:lvlJc w:val="left"/>
+      <w:pPr>
+        <w:tabs>
+          <w:tab w:val="num" w:pos="2160"/>
+        </w:tabs>
+        <w:ind w:left="2160" w:hanging="360"/>
+      </w:pPr>
+    </w:lvl>
+    <w:lvl w:ilvl="3" w:tentative="1">
+      <w:start w:val="1"/>
+      <w:numFmt w:val="decimal"/>
+      <w:lvlText w:val="%4."/>
+      <w:lvlJc w:val="left"/>
+      <w:pPr>
+        <w:tabs>
+          <w:tab w:val="num" w:pos="2880"/>
+        </w:tabs>
+        <w:ind w:left="2880" w:hanging="360"/>
+      </w:pPr>
+    </w:lvl>
+    <w:lvl w:ilvl="4" w:tentative="1">
+      <w:start w:val="1"/>
+      <w:numFmt w:val="decimal"/>
+      <w:lvlText w:val="%5."/>
+      <w:lvlJc w:val="left"/>
+      <w:pPr>
+        <w:tabs>
+          <w:tab w:val="num" w:pos="3600"/>
+        </w:tabs>
+        <w:ind w:left="3600" w:hanging="360"/>
+      </w:pPr>
+    </w:lvl>
+    <w:lvl w:ilvl="5" w:tentative="1">
+      <w:start w:val="1"/>
+      <w:numFmt w:val="decimal"/>
+      <w:lvlText w:val="%6."/>
+      <w:lvlJc w:val="left"/>
+      <w:pPr>
+        <w:tabs>
+          <w:tab w:val="num" w:pos="4320"/>
+        </w:tabs>
+        <w:ind w:left="4320" w:hanging="360"/>
+      </w:pPr>
+    </w:lvl>
+    <w:lvl w:ilvl="6" w:tentative="1">
+      <w:start w:val="1"/>
+      <w:numFmt w:val="decimal"/>
+      <w:lvlText w:val="%7."/>
+      <w:lvlJc w:val="left"/>
+      <w:pPr>
+        <w:tabs>
+          <w:tab w:val="num" w:pos="5040"/>
+        </w:tabs>
+        <w:ind w:left="5040" w:hanging="360"/>
+      </w:pPr>
+    </w:lvl>
+    <w:lvl w:ilvl="7" w:tentative="1">
+      <w:start w:val="1"/>
+      <w:numFmt w:val="decimal"/>
+      <w:lvlText w:val="%8."/>
+      <w:lvlJc w:val="left"/>
+      <w:pPr>
+        <w:tabs>
+          <w:tab w:val="num" w:pos="5760"/>
+        </w:tabs>
+        <w:ind w:left="5760" w:hanging="360"/>
+      </w:pPr>
+    </w:lvl>
+    <w:lvl w:ilvl="8" w:tentative="1">
+      <w:start w:val="1"/>
+      <w:numFmt w:val="decimal"/>
+      <w:lvlText w:val="%9."/>
+      <w:lvlJc w:val="left"/>
+      <w:pPr>
+        <w:tabs>
+          <w:tab w:val="num" w:pos="6480"/>
+        </w:tabs>
+        <w:ind w:left="6480" w:hanging="360"/>
+      </w:pPr>
+    </w:lvl>
+  </w:abstractNum>
+  <w:abstractNum w:abstractNumId="2" w15:restartNumberingAfterBreak="0">
     <w:nsid w:val="09E30269"/>
     <w:multiLevelType w:val="multilevel"/>
     <w:tmpl w:val="6AF24D9A"/>
@@ -1854,7 +4632,7 @@
       </w:rPr>
     </w:lvl>
   </w:abstractNum>
-  <w:abstractNum w:abstractNumId="1" w15:restartNumberingAfterBreak="0">
+  <w:abstractNum w:abstractNumId="3" w15:restartNumberingAfterBreak="0">
     <w:nsid w:val="0CEE3006"/>
     <w:multiLevelType w:val="multilevel"/>
     <w:tmpl w:val="344CB35A"/>
@@ -2003,7 +4781,7 @@
       </w:rPr>
     </w:lvl>
   </w:abstractNum>
-  <w:abstractNum w:abstractNumId="2" w15:restartNumberingAfterBreak="0">
+  <w:abstractNum w:abstractNumId="4" w15:restartNumberingAfterBreak="0">
     <w:nsid w:val="13A850AB"/>
     <w:multiLevelType w:val="multilevel"/>
     <w:tmpl w:val="ED7C5AA8"/>
@@ -2152,7 +4930,7 @@
       </w:rPr>
     </w:lvl>
   </w:abstractNum>
-  <w:abstractNum w:abstractNumId="3" w15:restartNumberingAfterBreak="0">
+  <w:abstractNum w:abstractNumId="5" w15:restartNumberingAfterBreak="0">
     <w:nsid w:val="14C5716B"/>
     <w:multiLevelType w:val="multilevel"/>
     <w:tmpl w:val="ADC00A10"/>
@@ -2301,7 +5079,7 @@
       </w:rPr>
     </w:lvl>
   </w:abstractNum>
-  <w:abstractNum w:abstractNumId="4" w15:restartNumberingAfterBreak="0">
+  <w:abstractNum w:abstractNumId="6" w15:restartNumberingAfterBreak="0">
     <w:nsid w:val="153120FA"/>
     <w:multiLevelType w:val="multilevel"/>
     <w:tmpl w:val="8C7025D2"/>
@@ -2450,7 +5228,7 @@
       </w:rPr>
     </w:lvl>
   </w:abstractNum>
-  <w:abstractNum w:abstractNumId="5" w15:restartNumberingAfterBreak="0">
+  <w:abstractNum w:abstractNumId="7" w15:restartNumberingAfterBreak="0">
     <w:nsid w:val="16915F95"/>
     <w:multiLevelType w:val="multilevel"/>
     <w:tmpl w:val="48704A84"/>
@@ -2599,7 +5377,7 @@
       </w:rPr>
     </w:lvl>
   </w:abstractNum>
-  <w:abstractNum w:abstractNumId="6" w15:restartNumberingAfterBreak="0">
+  <w:abstractNum w:abstractNumId="8" w15:restartNumberingAfterBreak="0">
     <w:nsid w:val="1B6A5725"/>
     <w:multiLevelType w:val="multilevel"/>
     <w:tmpl w:val="E7F43976"/>
@@ -2748,7 +5526,269 @@
       </w:rPr>
     </w:lvl>
   </w:abstractNum>
-  <w:abstractNum w:abstractNumId="7" w15:restartNumberingAfterBreak="0">
+  <w:abstractNum w:abstractNumId="9" w15:restartNumberingAfterBreak="0">
+    <w:nsid w:val="1F6F1FEF"/>
+    <w:multiLevelType w:val="multilevel"/>
+    <w:tmpl w:val="70EEE61C"/>
+    <w:lvl w:ilvl="0">
+      <w:start w:val="1"/>
+      <w:numFmt w:val="bullet"/>
+      <w:lvlText w:val=""/>
+      <w:lvlJc w:val="left"/>
+      <w:pPr>
+        <w:tabs>
+          <w:tab w:val="num" w:pos="720"/>
+        </w:tabs>
+        <w:ind w:left="720" w:hanging="360"/>
+      </w:pPr>
+      <w:rPr>
+        <w:rFonts w:ascii="Symbol" w:hAnsi="Symbol" w:hint="default"/>
+        <w:sz w:val="20"/>
+      </w:rPr>
+    </w:lvl>
+    <w:lvl w:ilvl="1" w:tentative="1">
+      <w:start w:val="1"/>
+      <w:numFmt w:val="bullet"/>
+      <w:lvlText w:val="o"/>
+      <w:lvlJc w:val="left"/>
+      <w:pPr>
+        <w:tabs>
+          <w:tab w:val="num" w:pos="1440"/>
+        </w:tabs>
+        <w:ind w:left="1440" w:hanging="360"/>
+      </w:pPr>
+      <w:rPr>
+        <w:rFonts w:ascii="Courier New" w:hAnsi="Courier New" w:hint="default"/>
+        <w:sz w:val="20"/>
+      </w:rPr>
+    </w:lvl>
+    <w:lvl w:ilvl="2" w:tentative="1">
+      <w:start w:val="1"/>
+      <w:numFmt w:val="bullet"/>
+      <w:lvlText w:val=""/>
+      <w:lvlJc w:val="left"/>
+      <w:pPr>
+        <w:tabs>
+          <w:tab w:val="num" w:pos="2160"/>
+        </w:tabs>
+        <w:ind w:left="2160" w:hanging="360"/>
+      </w:pPr>
+      <w:rPr>
+        <w:rFonts w:ascii="Wingdings" w:hAnsi="Wingdings" w:hint="default"/>
+        <w:sz w:val="20"/>
+      </w:rPr>
+    </w:lvl>
+    <w:lvl w:ilvl="3" w:tentative="1">
+      <w:start w:val="1"/>
+      <w:numFmt w:val="bullet"/>
+      <w:lvlText w:val=""/>
+      <w:lvlJc w:val="left"/>
+      <w:pPr>
+        <w:tabs>
+          <w:tab w:val="num" w:pos="2880"/>
+        </w:tabs>
+        <w:ind w:left="2880" w:hanging="360"/>
+      </w:pPr>
+      <w:rPr>
+        <w:rFonts w:ascii="Wingdings" w:hAnsi="Wingdings" w:hint="default"/>
+        <w:sz w:val="20"/>
+      </w:rPr>
+    </w:lvl>
+    <w:lvl w:ilvl="4" w:tentative="1">
+      <w:start w:val="1"/>
+      <w:numFmt w:val="bullet"/>
+      <w:lvlText w:val=""/>
+      <w:lvlJc w:val="left"/>
+      <w:pPr>
+        <w:tabs>
+          <w:tab w:val="num" w:pos="3600"/>
+        </w:tabs>
+        <w:ind w:left="3600" w:hanging="360"/>
+      </w:pPr>
+      <w:rPr>
+        <w:rFonts w:ascii="Wingdings" w:hAnsi="Wingdings" w:hint="default"/>
+        <w:sz w:val="20"/>
+      </w:rPr>
+    </w:lvl>
+    <w:lvl w:ilvl="5" w:tentative="1">
+      <w:start w:val="1"/>
+      <w:numFmt w:val="bullet"/>
+      <w:lvlText w:val=""/>
+      <w:lvlJc w:val="left"/>
+      <w:pPr>
+        <w:tabs>
+          <w:tab w:val="num" w:pos="4320"/>
+        </w:tabs>
+        <w:ind w:left="4320" w:hanging="360"/>
+      </w:pPr>
+      <w:rPr>
+        <w:rFonts w:ascii="Wingdings" w:hAnsi="Wingdings" w:hint="default"/>
+        <w:sz w:val="20"/>
+      </w:rPr>
+    </w:lvl>
+    <w:lvl w:ilvl="6" w:tentative="1">
+      <w:start w:val="1"/>
+      <w:numFmt w:val="bullet"/>
+      <w:lvlText w:val=""/>
+      <w:lvlJc w:val="left"/>
+      <w:pPr>
+        <w:tabs>
+          <w:tab w:val="num" w:pos="5040"/>
+        </w:tabs>
+        <w:ind w:left="5040" w:hanging="360"/>
+      </w:pPr>
+      <w:rPr>
+        <w:rFonts w:ascii="Wingdings" w:hAnsi="Wingdings" w:hint="default"/>
+        <w:sz w:val="20"/>
+      </w:rPr>
+    </w:lvl>
+    <w:lvl w:ilvl="7" w:tentative="1">
+      <w:start w:val="1"/>
+      <w:numFmt w:val="bullet"/>
+      <w:lvlText w:val=""/>
+      <w:lvlJc w:val="left"/>
+      <w:pPr>
+        <w:tabs>
+          <w:tab w:val="num" w:pos="5760"/>
+        </w:tabs>
+        <w:ind w:left="5760" w:hanging="360"/>
+      </w:pPr>
+      <w:rPr>
+        <w:rFonts w:ascii="Wingdings" w:hAnsi="Wingdings" w:hint="default"/>
+        <w:sz w:val="20"/>
+      </w:rPr>
+    </w:lvl>
+    <w:lvl w:ilvl="8" w:tentative="1">
+      <w:start w:val="1"/>
+      <w:numFmt w:val="bullet"/>
+      <w:lvlText w:val=""/>
+      <w:lvlJc w:val="left"/>
+      <w:pPr>
+        <w:tabs>
+          <w:tab w:val="num" w:pos="6480"/>
+        </w:tabs>
+        <w:ind w:left="6480" w:hanging="360"/>
+      </w:pPr>
+      <w:rPr>
+        <w:rFonts w:ascii="Wingdings" w:hAnsi="Wingdings" w:hint="default"/>
+        <w:sz w:val="20"/>
+      </w:rPr>
+    </w:lvl>
+  </w:abstractNum>
+  <w:abstractNum w:abstractNumId="10" w15:restartNumberingAfterBreak="0">
+    <w:nsid w:val="212072F0"/>
+    <w:multiLevelType w:val="multilevel"/>
+    <w:tmpl w:val="5128D3D2"/>
+    <w:lvl w:ilvl="0">
+      <w:start w:val="1"/>
+      <w:numFmt w:val="decimal"/>
+      <w:lvlText w:val="%1."/>
+      <w:lvlJc w:val="left"/>
+      <w:pPr>
+        <w:tabs>
+          <w:tab w:val="num" w:pos="720"/>
+        </w:tabs>
+        <w:ind w:left="720" w:hanging="360"/>
+      </w:pPr>
+    </w:lvl>
+    <w:lvl w:ilvl="1" w:tentative="1">
+      <w:start w:val="1"/>
+      <w:numFmt w:val="decimal"/>
+      <w:lvlText w:val="%2."/>
+      <w:lvlJc w:val="left"/>
+      <w:pPr>
+        <w:tabs>
+          <w:tab w:val="num" w:pos="1440"/>
+        </w:tabs>
+        <w:ind w:left="1440" w:hanging="360"/>
+      </w:pPr>
+    </w:lvl>
+    <w:lvl w:ilvl="2" w:tentative="1">
+      <w:start w:val="1"/>
+      <w:numFmt w:val="decimal"/>
+      <w:lvlText w:val="%3."/>
+      <w:lvlJc w:val="left"/>
+      <w:pPr>
+        <w:tabs>
+          <w:tab w:val="num" w:pos="2160"/>
+        </w:tabs>
+        <w:ind w:left="2160" w:hanging="360"/>
+      </w:pPr>
+    </w:lvl>
+    <w:lvl w:ilvl="3" w:tentative="1">
+      <w:start w:val="1"/>
+      <w:numFmt w:val="decimal"/>
+      <w:lvlText w:val="%4."/>
+      <w:lvlJc w:val="left"/>
+      <w:pPr>
+        <w:tabs>
+          <w:tab w:val="num" w:pos="2880"/>
+        </w:tabs>
+        <w:ind w:left="2880" w:hanging="360"/>
+      </w:pPr>
+    </w:lvl>
+    <w:lvl w:ilvl="4" w:tentative="1">
+      <w:start w:val="1"/>
+      <w:numFmt w:val="decimal"/>
+      <w:lvlText w:val="%5."/>
+      <w:lvlJc w:val="left"/>
+      <w:pPr>
+        <w:tabs>
+          <w:tab w:val="num" w:pos="3600"/>
+        </w:tabs>
+        <w:ind w:left="3600" w:hanging="360"/>
+      </w:pPr>
+    </w:lvl>
+    <w:lvl w:ilvl="5" w:tentative="1">
+      <w:start w:val="1"/>
+      <w:numFmt w:val="decimal"/>
+      <w:lvlText w:val="%6."/>
+      <w:lvlJc w:val="left"/>
+      <w:pPr>
+        <w:tabs>
+          <w:tab w:val="num" w:pos="4320"/>
+        </w:tabs>
+        <w:ind w:left="4320" w:hanging="360"/>
+      </w:pPr>
+    </w:lvl>
+    <w:lvl w:ilvl="6" w:tentative="1">
+      <w:start w:val="1"/>
+      <w:numFmt w:val="decimal"/>
+      <w:lvlText w:val="%7."/>
+      <w:lvlJc w:val="left"/>
+      <w:pPr>
+        <w:tabs>
+          <w:tab w:val="num" w:pos="5040"/>
+        </w:tabs>
+        <w:ind w:left="5040" w:hanging="360"/>
+      </w:pPr>
+    </w:lvl>
+    <w:lvl w:ilvl="7" w:tentative="1">
+      <w:start w:val="1"/>
+      <w:numFmt w:val="decimal"/>
+      <w:lvlText w:val="%8."/>
+      <w:lvlJc w:val="left"/>
+      <w:pPr>
+        <w:tabs>
+          <w:tab w:val="num" w:pos="5760"/>
+        </w:tabs>
+        <w:ind w:left="5760" w:hanging="360"/>
+      </w:pPr>
+    </w:lvl>
+    <w:lvl w:ilvl="8" w:tentative="1">
+      <w:start w:val="1"/>
+      <w:numFmt w:val="decimal"/>
+      <w:lvlText w:val="%9."/>
+      <w:lvlJc w:val="left"/>
+      <w:pPr>
+        <w:tabs>
+          <w:tab w:val="num" w:pos="6480"/>
+        </w:tabs>
+        <w:ind w:left="6480" w:hanging="360"/>
+      </w:pPr>
+    </w:lvl>
+  </w:abstractNum>
+  <w:abstractNum w:abstractNumId="11" w15:restartNumberingAfterBreak="0">
     <w:nsid w:val="273674DB"/>
     <w:multiLevelType w:val="multilevel"/>
     <w:tmpl w:val="A872AE9E"/>
@@ -2897,7 +5937,269 @@
       </w:rPr>
     </w:lvl>
   </w:abstractNum>
-  <w:abstractNum w:abstractNumId="8" w15:restartNumberingAfterBreak="0">
+  <w:abstractNum w:abstractNumId="12" w15:restartNumberingAfterBreak="0">
+    <w:nsid w:val="2A5E0E67"/>
+    <w:multiLevelType w:val="multilevel"/>
+    <w:tmpl w:val="4F363AA8"/>
+    <w:lvl w:ilvl="0">
+      <w:start w:val="1"/>
+      <w:numFmt w:val="bullet"/>
+      <w:lvlText w:val=""/>
+      <w:lvlJc w:val="left"/>
+      <w:pPr>
+        <w:tabs>
+          <w:tab w:val="num" w:pos="720"/>
+        </w:tabs>
+        <w:ind w:left="720" w:hanging="360"/>
+      </w:pPr>
+      <w:rPr>
+        <w:rFonts w:ascii="Symbol" w:hAnsi="Symbol" w:hint="default"/>
+        <w:sz w:val="20"/>
+      </w:rPr>
+    </w:lvl>
+    <w:lvl w:ilvl="1" w:tentative="1">
+      <w:start w:val="1"/>
+      <w:numFmt w:val="bullet"/>
+      <w:lvlText w:val="o"/>
+      <w:lvlJc w:val="left"/>
+      <w:pPr>
+        <w:tabs>
+          <w:tab w:val="num" w:pos="1440"/>
+        </w:tabs>
+        <w:ind w:left="1440" w:hanging="360"/>
+      </w:pPr>
+      <w:rPr>
+        <w:rFonts w:ascii="Courier New" w:hAnsi="Courier New" w:hint="default"/>
+        <w:sz w:val="20"/>
+      </w:rPr>
+    </w:lvl>
+    <w:lvl w:ilvl="2" w:tentative="1">
+      <w:start w:val="1"/>
+      <w:numFmt w:val="bullet"/>
+      <w:lvlText w:val=""/>
+      <w:lvlJc w:val="left"/>
+      <w:pPr>
+        <w:tabs>
+          <w:tab w:val="num" w:pos="2160"/>
+        </w:tabs>
+        <w:ind w:left="2160" w:hanging="360"/>
+      </w:pPr>
+      <w:rPr>
+        <w:rFonts w:ascii="Wingdings" w:hAnsi="Wingdings" w:hint="default"/>
+        <w:sz w:val="20"/>
+      </w:rPr>
+    </w:lvl>
+    <w:lvl w:ilvl="3" w:tentative="1">
+      <w:start w:val="1"/>
+      <w:numFmt w:val="bullet"/>
+      <w:lvlText w:val=""/>
+      <w:lvlJc w:val="left"/>
+      <w:pPr>
+        <w:tabs>
+          <w:tab w:val="num" w:pos="2880"/>
+        </w:tabs>
+        <w:ind w:left="2880" w:hanging="360"/>
+      </w:pPr>
+      <w:rPr>
+        <w:rFonts w:ascii="Wingdings" w:hAnsi="Wingdings" w:hint="default"/>
+        <w:sz w:val="20"/>
+      </w:rPr>
+    </w:lvl>
+    <w:lvl w:ilvl="4" w:tentative="1">
+      <w:start w:val="1"/>
+      <w:numFmt w:val="bullet"/>
+      <w:lvlText w:val=""/>
+      <w:lvlJc w:val="left"/>
+      <w:pPr>
+        <w:tabs>
+          <w:tab w:val="num" w:pos="3600"/>
+        </w:tabs>
+        <w:ind w:left="3600" w:hanging="360"/>
+      </w:pPr>
+      <w:rPr>
+        <w:rFonts w:ascii="Wingdings" w:hAnsi="Wingdings" w:hint="default"/>
+        <w:sz w:val="20"/>
+      </w:rPr>
+    </w:lvl>
+    <w:lvl w:ilvl="5" w:tentative="1">
+      <w:start w:val="1"/>
+      <w:numFmt w:val="bullet"/>
+      <w:lvlText w:val=""/>
+      <w:lvlJc w:val="left"/>
+      <w:pPr>
+        <w:tabs>
+          <w:tab w:val="num" w:pos="4320"/>
+        </w:tabs>
+        <w:ind w:left="4320" w:hanging="360"/>
+      </w:pPr>
+      <w:rPr>
+        <w:rFonts w:ascii="Wingdings" w:hAnsi="Wingdings" w:hint="default"/>
+        <w:sz w:val="20"/>
+      </w:rPr>
+    </w:lvl>
+    <w:lvl w:ilvl="6" w:tentative="1">
+      <w:start w:val="1"/>
+      <w:numFmt w:val="bullet"/>
+      <w:lvlText w:val=""/>
+      <w:lvlJc w:val="left"/>
+      <w:pPr>
+        <w:tabs>
+          <w:tab w:val="num" w:pos="5040"/>
+        </w:tabs>
+        <w:ind w:left="5040" w:hanging="360"/>
+      </w:pPr>
+      <w:rPr>
+        <w:rFonts w:ascii="Wingdings" w:hAnsi="Wingdings" w:hint="default"/>
+        <w:sz w:val="20"/>
+      </w:rPr>
+    </w:lvl>
+    <w:lvl w:ilvl="7" w:tentative="1">
+      <w:start w:val="1"/>
+      <w:numFmt w:val="bullet"/>
+      <w:lvlText w:val=""/>
+      <w:lvlJc w:val="left"/>
+      <w:pPr>
+        <w:tabs>
+          <w:tab w:val="num" w:pos="5760"/>
+        </w:tabs>
+        <w:ind w:left="5760" w:hanging="360"/>
+      </w:pPr>
+      <w:rPr>
+        <w:rFonts w:ascii="Wingdings" w:hAnsi="Wingdings" w:hint="default"/>
+        <w:sz w:val="20"/>
+      </w:rPr>
+    </w:lvl>
+    <w:lvl w:ilvl="8" w:tentative="1">
+      <w:start w:val="1"/>
+      <w:numFmt w:val="bullet"/>
+      <w:lvlText w:val=""/>
+      <w:lvlJc w:val="left"/>
+      <w:pPr>
+        <w:tabs>
+          <w:tab w:val="num" w:pos="6480"/>
+        </w:tabs>
+        <w:ind w:left="6480" w:hanging="360"/>
+      </w:pPr>
+      <w:rPr>
+        <w:rFonts w:ascii="Wingdings" w:hAnsi="Wingdings" w:hint="default"/>
+        <w:sz w:val="20"/>
+      </w:rPr>
+    </w:lvl>
+  </w:abstractNum>
+  <w:abstractNum w:abstractNumId="13" w15:restartNumberingAfterBreak="0">
+    <w:nsid w:val="2FDB13AA"/>
+    <w:multiLevelType w:val="multilevel"/>
+    <w:tmpl w:val="2E942C64"/>
+    <w:lvl w:ilvl="0">
+      <w:start w:val="1"/>
+      <w:numFmt w:val="decimal"/>
+      <w:lvlText w:val="%1."/>
+      <w:lvlJc w:val="left"/>
+      <w:pPr>
+        <w:tabs>
+          <w:tab w:val="num" w:pos="720"/>
+        </w:tabs>
+        <w:ind w:left="720" w:hanging="360"/>
+      </w:pPr>
+    </w:lvl>
+    <w:lvl w:ilvl="1" w:tentative="1">
+      <w:start w:val="1"/>
+      <w:numFmt w:val="decimal"/>
+      <w:lvlText w:val="%2."/>
+      <w:lvlJc w:val="left"/>
+      <w:pPr>
+        <w:tabs>
+          <w:tab w:val="num" w:pos="1440"/>
+        </w:tabs>
+        <w:ind w:left="1440" w:hanging="360"/>
+      </w:pPr>
+    </w:lvl>
+    <w:lvl w:ilvl="2" w:tentative="1">
+      <w:start w:val="1"/>
+      <w:numFmt w:val="decimal"/>
+      <w:lvlText w:val="%3."/>
+      <w:lvlJc w:val="left"/>
+      <w:pPr>
+        <w:tabs>
+          <w:tab w:val="num" w:pos="2160"/>
+        </w:tabs>
+        <w:ind w:left="2160" w:hanging="360"/>
+      </w:pPr>
+    </w:lvl>
+    <w:lvl w:ilvl="3" w:tentative="1">
+      <w:start w:val="1"/>
+      <w:numFmt w:val="decimal"/>
+      <w:lvlText w:val="%4."/>
+      <w:lvlJc w:val="left"/>
+      <w:pPr>
+        <w:tabs>
+          <w:tab w:val="num" w:pos="2880"/>
+        </w:tabs>
+        <w:ind w:left="2880" w:hanging="360"/>
+      </w:pPr>
+    </w:lvl>
+    <w:lvl w:ilvl="4" w:tentative="1">
+      <w:start w:val="1"/>
+      <w:numFmt w:val="decimal"/>
+      <w:lvlText w:val="%5."/>
+      <w:lvlJc w:val="left"/>
+      <w:pPr>
+        <w:tabs>
+          <w:tab w:val="num" w:pos="3600"/>
+        </w:tabs>
+        <w:ind w:left="3600" w:hanging="360"/>
+      </w:pPr>
+    </w:lvl>
+    <w:lvl w:ilvl="5" w:tentative="1">
+      <w:start w:val="1"/>
+      <w:numFmt w:val="decimal"/>
+      <w:lvlText w:val="%6."/>
+      <w:lvlJc w:val="left"/>
+      <w:pPr>
+        <w:tabs>
+          <w:tab w:val="num" w:pos="4320"/>
+        </w:tabs>
+        <w:ind w:left="4320" w:hanging="360"/>
+      </w:pPr>
+    </w:lvl>
+    <w:lvl w:ilvl="6" w:tentative="1">
+      <w:start w:val="1"/>
+      <w:numFmt w:val="decimal"/>
+      <w:lvlText w:val="%7."/>
+      <w:lvlJc w:val="left"/>
+      <w:pPr>
+        <w:tabs>
+          <w:tab w:val="num" w:pos="5040"/>
+        </w:tabs>
+        <w:ind w:left="5040" w:hanging="360"/>
+      </w:pPr>
+    </w:lvl>
+    <w:lvl w:ilvl="7" w:tentative="1">
+      <w:start w:val="1"/>
+      <w:numFmt w:val="decimal"/>
+      <w:lvlText w:val="%8."/>
+      <w:lvlJc w:val="left"/>
+      <w:pPr>
+        <w:tabs>
+          <w:tab w:val="num" w:pos="5760"/>
+        </w:tabs>
+        <w:ind w:left="5760" w:hanging="360"/>
+      </w:pPr>
+    </w:lvl>
+    <w:lvl w:ilvl="8" w:tentative="1">
+      <w:start w:val="1"/>
+      <w:numFmt w:val="decimal"/>
+      <w:lvlText w:val="%9."/>
+      <w:lvlJc w:val="left"/>
+      <w:pPr>
+        <w:tabs>
+          <w:tab w:val="num" w:pos="6480"/>
+        </w:tabs>
+        <w:ind w:left="6480" w:hanging="360"/>
+      </w:pPr>
+    </w:lvl>
+  </w:abstractNum>
+  <w:abstractNum w:abstractNumId="14" w15:restartNumberingAfterBreak="0">
     <w:nsid w:val="2FDE1944"/>
     <w:multiLevelType w:val="multilevel"/>
     <w:tmpl w:val="E714817A"/>
@@ -3046,7 +6348,7 @@
       </w:rPr>
     </w:lvl>
   </w:abstractNum>
-  <w:abstractNum w:abstractNumId="9" w15:restartNumberingAfterBreak="0">
+  <w:abstractNum w:abstractNumId="15" w15:restartNumberingAfterBreak="0">
     <w:nsid w:val="311822B7"/>
     <w:multiLevelType w:val="multilevel"/>
     <w:tmpl w:val="218691B2"/>
@@ -3195,7 +6497,7 @@
       </w:rPr>
     </w:lvl>
   </w:abstractNum>
-  <w:abstractNum w:abstractNumId="10" w15:restartNumberingAfterBreak="0">
+  <w:abstractNum w:abstractNumId="16" w15:restartNumberingAfterBreak="0">
     <w:nsid w:val="3318594B"/>
     <w:multiLevelType w:val="multilevel"/>
     <w:tmpl w:val="D2DA9CD8"/>
@@ -3344,7 +6646,305 @@
       </w:rPr>
     </w:lvl>
   </w:abstractNum>
-  <w:abstractNum w:abstractNumId="11" w15:restartNumberingAfterBreak="0">
+  <w:abstractNum w:abstractNumId="17" w15:restartNumberingAfterBreak="0">
+    <w:nsid w:val="3330084C"/>
+    <w:multiLevelType w:val="multilevel"/>
+    <w:tmpl w:val="F45ACA2E"/>
+    <w:lvl w:ilvl="0">
+      <w:start w:val="1"/>
+      <w:numFmt w:val="bullet"/>
+      <w:lvlText w:val=""/>
+      <w:lvlJc w:val="left"/>
+      <w:pPr>
+        <w:tabs>
+          <w:tab w:val="num" w:pos="720"/>
+        </w:tabs>
+        <w:ind w:left="720" w:hanging="360"/>
+      </w:pPr>
+      <w:rPr>
+        <w:rFonts w:ascii="Symbol" w:hAnsi="Symbol" w:hint="default"/>
+        <w:sz w:val="20"/>
+      </w:rPr>
+    </w:lvl>
+    <w:lvl w:ilvl="1" w:tentative="1">
+      <w:start w:val="1"/>
+      <w:numFmt w:val="bullet"/>
+      <w:lvlText w:val="o"/>
+      <w:lvlJc w:val="left"/>
+      <w:pPr>
+        <w:tabs>
+          <w:tab w:val="num" w:pos="1440"/>
+        </w:tabs>
+        <w:ind w:left="1440" w:hanging="360"/>
+      </w:pPr>
+      <w:rPr>
+        <w:rFonts w:ascii="Courier New" w:hAnsi="Courier New" w:hint="default"/>
+        <w:sz w:val="20"/>
+      </w:rPr>
+    </w:lvl>
+    <w:lvl w:ilvl="2" w:tentative="1">
+      <w:start w:val="1"/>
+      <w:numFmt w:val="bullet"/>
+      <w:lvlText w:val=""/>
+      <w:lvlJc w:val="left"/>
+      <w:pPr>
+        <w:tabs>
+          <w:tab w:val="num" w:pos="2160"/>
+        </w:tabs>
+        <w:ind w:left="2160" w:hanging="360"/>
+      </w:pPr>
+      <w:rPr>
+        <w:rFonts w:ascii="Wingdings" w:hAnsi="Wingdings" w:hint="default"/>
+        <w:sz w:val="20"/>
+      </w:rPr>
+    </w:lvl>
+    <w:lvl w:ilvl="3" w:tentative="1">
+      <w:start w:val="1"/>
+      <w:numFmt w:val="bullet"/>
+      <w:lvlText w:val=""/>
+      <w:lvlJc w:val="left"/>
+      <w:pPr>
+        <w:tabs>
+          <w:tab w:val="num" w:pos="2880"/>
+        </w:tabs>
+        <w:ind w:left="2880" w:hanging="360"/>
+      </w:pPr>
+      <w:rPr>
+        <w:rFonts w:ascii="Wingdings" w:hAnsi="Wingdings" w:hint="default"/>
+        <w:sz w:val="20"/>
+      </w:rPr>
+    </w:lvl>
+    <w:lvl w:ilvl="4" w:tentative="1">
+      <w:start w:val="1"/>
+      <w:numFmt w:val="bullet"/>
+      <w:lvlText w:val=""/>
+      <w:lvlJc w:val="left"/>
+      <w:pPr>
+        <w:tabs>
+          <w:tab w:val="num" w:pos="3600"/>
+        </w:tabs>
+        <w:ind w:left="3600" w:hanging="360"/>
+      </w:pPr>
+      <w:rPr>
+        <w:rFonts w:ascii="Wingdings" w:hAnsi="Wingdings" w:hint="default"/>
+        <w:sz w:val="20"/>
+      </w:rPr>
+    </w:lvl>
+    <w:lvl w:ilvl="5" w:tentative="1">
+      <w:start w:val="1"/>
+      <w:numFmt w:val="bullet"/>
+      <w:lvlText w:val=""/>
+      <w:lvlJc w:val="left"/>
+      <w:pPr>
+        <w:tabs>
+          <w:tab w:val="num" w:pos="4320"/>
+        </w:tabs>
+        <w:ind w:left="4320" w:hanging="360"/>
+      </w:pPr>
+      <w:rPr>
+        <w:rFonts w:ascii="Wingdings" w:hAnsi="Wingdings" w:hint="default"/>
+        <w:sz w:val="20"/>
+      </w:rPr>
+    </w:lvl>
+    <w:lvl w:ilvl="6" w:tentative="1">
+      <w:start w:val="1"/>
+      <w:numFmt w:val="bullet"/>
+      <w:lvlText w:val=""/>
+      <w:lvlJc w:val="left"/>
+      <w:pPr>
+        <w:tabs>
+          <w:tab w:val="num" w:pos="5040"/>
+        </w:tabs>
+        <w:ind w:left="5040" w:hanging="360"/>
+      </w:pPr>
+      <w:rPr>
+        <w:rFonts w:ascii="Wingdings" w:hAnsi="Wingdings" w:hint="default"/>
+        <w:sz w:val="20"/>
+      </w:rPr>
+    </w:lvl>
+    <w:lvl w:ilvl="7" w:tentative="1">
+      <w:start w:val="1"/>
+      <w:numFmt w:val="bullet"/>
+      <w:lvlText w:val=""/>
+      <w:lvlJc w:val="left"/>
+      <w:pPr>
+        <w:tabs>
+          <w:tab w:val="num" w:pos="5760"/>
+        </w:tabs>
+        <w:ind w:left="5760" w:hanging="360"/>
+      </w:pPr>
+      <w:rPr>
+        <w:rFonts w:ascii="Wingdings" w:hAnsi="Wingdings" w:hint="default"/>
+        <w:sz w:val="20"/>
+      </w:rPr>
+    </w:lvl>
+    <w:lvl w:ilvl="8" w:tentative="1">
+      <w:start w:val="1"/>
+      <w:numFmt w:val="bullet"/>
+      <w:lvlText w:val=""/>
+      <w:lvlJc w:val="left"/>
+      <w:pPr>
+        <w:tabs>
+          <w:tab w:val="num" w:pos="6480"/>
+        </w:tabs>
+        <w:ind w:left="6480" w:hanging="360"/>
+      </w:pPr>
+      <w:rPr>
+        <w:rFonts w:ascii="Wingdings" w:hAnsi="Wingdings" w:hint="default"/>
+        <w:sz w:val="20"/>
+      </w:rPr>
+    </w:lvl>
+  </w:abstractNum>
+  <w:abstractNum w:abstractNumId="18" w15:restartNumberingAfterBreak="0">
+    <w:nsid w:val="33631836"/>
+    <w:multiLevelType w:val="multilevel"/>
+    <w:tmpl w:val="E7B0DAEA"/>
+    <w:lvl w:ilvl="0">
+      <w:start w:val="1"/>
+      <w:numFmt w:val="bullet"/>
+      <w:lvlText w:val=""/>
+      <w:lvlJc w:val="left"/>
+      <w:pPr>
+        <w:tabs>
+          <w:tab w:val="num" w:pos="720"/>
+        </w:tabs>
+        <w:ind w:left="720" w:hanging="360"/>
+      </w:pPr>
+      <w:rPr>
+        <w:rFonts w:ascii="Symbol" w:hAnsi="Symbol" w:hint="default"/>
+        <w:sz w:val="20"/>
+      </w:rPr>
+    </w:lvl>
+    <w:lvl w:ilvl="1" w:tentative="1">
+      <w:start w:val="1"/>
+      <w:numFmt w:val="bullet"/>
+      <w:lvlText w:val="o"/>
+      <w:lvlJc w:val="left"/>
+      <w:pPr>
+        <w:tabs>
+          <w:tab w:val="num" w:pos="1440"/>
+        </w:tabs>
+        <w:ind w:left="1440" w:hanging="360"/>
+      </w:pPr>
+      <w:rPr>
+        <w:rFonts w:ascii="Courier New" w:hAnsi="Courier New" w:hint="default"/>
+        <w:sz w:val="20"/>
+      </w:rPr>
+    </w:lvl>
+    <w:lvl w:ilvl="2" w:tentative="1">
+      <w:start w:val="1"/>
+      <w:numFmt w:val="bullet"/>
+      <w:lvlText w:val=""/>
+      <w:lvlJc w:val="left"/>
+      <w:pPr>
+        <w:tabs>
+          <w:tab w:val="num" w:pos="2160"/>
+        </w:tabs>
+        <w:ind w:left="2160" w:hanging="360"/>
+      </w:pPr>
+      <w:rPr>
+        <w:rFonts w:ascii="Wingdings" w:hAnsi="Wingdings" w:hint="default"/>
+        <w:sz w:val="20"/>
+      </w:rPr>
+    </w:lvl>
+    <w:lvl w:ilvl="3" w:tentative="1">
+      <w:start w:val="1"/>
+      <w:numFmt w:val="bullet"/>
+      <w:lvlText w:val=""/>
+      <w:lvlJc w:val="left"/>
+      <w:pPr>
+        <w:tabs>
+          <w:tab w:val="num" w:pos="2880"/>
+        </w:tabs>
+        <w:ind w:left="2880" w:hanging="360"/>
+      </w:pPr>
+      <w:rPr>
+        <w:rFonts w:ascii="Wingdings" w:hAnsi="Wingdings" w:hint="default"/>
+        <w:sz w:val="20"/>
+      </w:rPr>
+    </w:lvl>
+    <w:lvl w:ilvl="4" w:tentative="1">
+      <w:start w:val="1"/>
+      <w:numFmt w:val="bullet"/>
+      <w:lvlText w:val=""/>
+      <w:lvlJc w:val="left"/>
+      <w:pPr>
+        <w:tabs>
+          <w:tab w:val="num" w:pos="3600"/>
+        </w:tabs>
+        <w:ind w:left="3600" w:hanging="360"/>
+      </w:pPr>
+      <w:rPr>
+        <w:rFonts w:ascii="Wingdings" w:hAnsi="Wingdings" w:hint="default"/>
+        <w:sz w:val="20"/>
+      </w:rPr>
+    </w:lvl>
+    <w:lvl w:ilvl="5" w:tentative="1">
+      <w:start w:val="1"/>
+      <w:numFmt w:val="bullet"/>
+      <w:lvlText w:val=""/>
+      <w:lvlJc w:val="left"/>
+      <w:pPr>
+        <w:tabs>
+          <w:tab w:val="num" w:pos="4320"/>
+        </w:tabs>
+        <w:ind w:left="4320" w:hanging="360"/>
+      </w:pPr>
+      <w:rPr>
+        <w:rFonts w:ascii="Wingdings" w:hAnsi="Wingdings" w:hint="default"/>
+        <w:sz w:val="20"/>
+      </w:rPr>
+    </w:lvl>
+    <w:lvl w:ilvl="6" w:tentative="1">
+      <w:start w:val="1"/>
+      <w:numFmt w:val="bullet"/>
+      <w:lvlText w:val=""/>
+      <w:lvlJc w:val="left"/>
+      <w:pPr>
+        <w:tabs>
+          <w:tab w:val="num" w:pos="5040"/>
+        </w:tabs>
+        <w:ind w:left="5040" w:hanging="360"/>
+      </w:pPr>
+      <w:rPr>
+        <w:rFonts w:ascii="Wingdings" w:hAnsi="Wingdings" w:hint="default"/>
+        <w:sz w:val="20"/>
+      </w:rPr>
+    </w:lvl>
+    <w:lvl w:ilvl="7" w:tentative="1">
+      <w:start w:val="1"/>
+      <w:numFmt w:val="bullet"/>
+      <w:lvlText w:val=""/>
+      <w:lvlJc w:val="left"/>
+      <w:pPr>
+        <w:tabs>
+          <w:tab w:val="num" w:pos="5760"/>
+        </w:tabs>
+        <w:ind w:left="5760" w:hanging="360"/>
+      </w:pPr>
+      <w:rPr>
+        <w:rFonts w:ascii="Wingdings" w:hAnsi="Wingdings" w:hint="default"/>
+        <w:sz w:val="20"/>
+      </w:rPr>
+    </w:lvl>
+    <w:lvl w:ilvl="8" w:tentative="1">
+      <w:start w:val="1"/>
+      <w:numFmt w:val="bullet"/>
+      <w:lvlText w:val=""/>
+      <w:lvlJc w:val="left"/>
+      <w:pPr>
+        <w:tabs>
+          <w:tab w:val="num" w:pos="6480"/>
+        </w:tabs>
+        <w:ind w:left="6480" w:hanging="360"/>
+      </w:pPr>
+      <w:rPr>
+        <w:rFonts w:ascii="Wingdings" w:hAnsi="Wingdings" w:hint="default"/>
+        <w:sz w:val="20"/>
+      </w:rPr>
+    </w:lvl>
+  </w:abstractNum>
+  <w:abstractNum w:abstractNumId="19" w15:restartNumberingAfterBreak="0">
     <w:nsid w:val="362C6FCC"/>
     <w:multiLevelType w:val="multilevel"/>
     <w:tmpl w:val="48CE6E5A"/>
@@ -3461,7 +7061,156 @@
       </w:pPr>
     </w:lvl>
   </w:abstractNum>
-  <w:abstractNum w:abstractNumId="12" w15:restartNumberingAfterBreak="0">
+  <w:abstractNum w:abstractNumId="20" w15:restartNumberingAfterBreak="0">
+    <w:nsid w:val="3C26389E"/>
+    <w:multiLevelType w:val="multilevel"/>
+    <w:tmpl w:val="AD74BC42"/>
+    <w:lvl w:ilvl="0">
+      <w:start w:val="1"/>
+      <w:numFmt w:val="bullet"/>
+      <w:lvlText w:val=""/>
+      <w:lvlJc w:val="left"/>
+      <w:pPr>
+        <w:tabs>
+          <w:tab w:val="num" w:pos="720"/>
+        </w:tabs>
+        <w:ind w:left="720" w:hanging="360"/>
+      </w:pPr>
+      <w:rPr>
+        <w:rFonts w:ascii="Symbol" w:hAnsi="Symbol" w:hint="default"/>
+        <w:sz w:val="20"/>
+      </w:rPr>
+    </w:lvl>
+    <w:lvl w:ilvl="1">
+      <w:start w:val="1"/>
+      <w:numFmt w:val="bullet"/>
+      <w:lvlText w:val="o"/>
+      <w:lvlJc w:val="left"/>
+      <w:pPr>
+        <w:tabs>
+          <w:tab w:val="num" w:pos="1440"/>
+        </w:tabs>
+        <w:ind w:left="1440" w:hanging="360"/>
+      </w:pPr>
+      <w:rPr>
+        <w:rFonts w:ascii="Courier New" w:hAnsi="Courier New" w:hint="default"/>
+        <w:sz w:val="20"/>
+      </w:rPr>
+    </w:lvl>
+    <w:lvl w:ilvl="2" w:tentative="1">
+      <w:start w:val="1"/>
+      <w:numFmt w:val="bullet"/>
+      <w:lvlText w:val=""/>
+      <w:lvlJc w:val="left"/>
+      <w:pPr>
+        <w:tabs>
+          <w:tab w:val="num" w:pos="2160"/>
+        </w:tabs>
+        <w:ind w:left="2160" w:hanging="360"/>
+      </w:pPr>
+      <w:rPr>
+        <w:rFonts w:ascii="Wingdings" w:hAnsi="Wingdings" w:hint="default"/>
+        <w:sz w:val="20"/>
+      </w:rPr>
+    </w:lvl>
+    <w:lvl w:ilvl="3" w:tentative="1">
+      <w:start w:val="1"/>
+      <w:numFmt w:val="bullet"/>
+      <w:lvlText w:val=""/>
+      <w:lvlJc w:val="left"/>
+      <w:pPr>
+        <w:tabs>
+          <w:tab w:val="num" w:pos="2880"/>
+        </w:tabs>
+        <w:ind w:left="2880" w:hanging="360"/>
+      </w:pPr>
+      <w:rPr>
+        <w:rFonts w:ascii="Wingdings" w:hAnsi="Wingdings" w:hint="default"/>
+        <w:sz w:val="20"/>
+      </w:rPr>
+    </w:lvl>
+    <w:lvl w:ilvl="4" w:tentative="1">
+      <w:start w:val="1"/>
+      <w:numFmt w:val="bullet"/>
+      <w:lvlText w:val=""/>
+      <w:lvlJc w:val="left"/>
+      <w:pPr>
+        <w:tabs>
+          <w:tab w:val="num" w:pos="3600"/>
+        </w:tabs>
+        <w:ind w:left="3600" w:hanging="360"/>
+      </w:pPr>
+      <w:rPr>
+        <w:rFonts w:ascii="Wingdings" w:hAnsi="Wingdings" w:hint="default"/>
+        <w:sz w:val="20"/>
+      </w:rPr>
+    </w:lvl>
+    <w:lvl w:ilvl="5" w:tentative="1">
+      <w:start w:val="1"/>
+      <w:numFmt w:val="bullet"/>
+      <w:lvlText w:val=""/>
+      <w:lvlJc w:val="left"/>
+      <w:pPr>
+        <w:tabs>
+          <w:tab w:val="num" w:pos="4320"/>
+        </w:tabs>
+        <w:ind w:left="4320" w:hanging="360"/>
+      </w:pPr>
+      <w:rPr>
+        <w:rFonts w:ascii="Wingdings" w:hAnsi="Wingdings" w:hint="default"/>
+        <w:sz w:val="20"/>
+      </w:rPr>
+    </w:lvl>
+    <w:lvl w:ilvl="6" w:tentative="1">
+      <w:start w:val="1"/>
+      <w:numFmt w:val="bullet"/>
+      <w:lvlText w:val=""/>
+      <w:lvlJc w:val="left"/>
+      <w:pPr>
+        <w:tabs>
+          <w:tab w:val="num" w:pos="5040"/>
+        </w:tabs>
+        <w:ind w:left="5040" w:hanging="360"/>
+      </w:pPr>
+      <w:rPr>
+        <w:rFonts w:ascii="Wingdings" w:hAnsi="Wingdings" w:hint="default"/>
+        <w:sz w:val="20"/>
+      </w:rPr>
+    </w:lvl>
+    <w:lvl w:ilvl="7" w:tentative="1">
+      <w:start w:val="1"/>
+      <w:numFmt w:val="bullet"/>
+      <w:lvlText w:val=""/>
+      <w:lvlJc w:val="left"/>
+      <w:pPr>
+        <w:tabs>
+          <w:tab w:val="num" w:pos="5760"/>
+        </w:tabs>
+        <w:ind w:left="5760" w:hanging="360"/>
+      </w:pPr>
+      <w:rPr>
+        <w:rFonts w:ascii="Wingdings" w:hAnsi="Wingdings" w:hint="default"/>
+        <w:sz w:val="20"/>
+      </w:rPr>
+    </w:lvl>
+    <w:lvl w:ilvl="8" w:tentative="1">
+      <w:start w:val="1"/>
+      <w:numFmt w:val="bullet"/>
+      <w:lvlText w:val=""/>
+      <w:lvlJc w:val="left"/>
+      <w:pPr>
+        <w:tabs>
+          <w:tab w:val="num" w:pos="6480"/>
+        </w:tabs>
+        <w:ind w:left="6480" w:hanging="360"/>
+      </w:pPr>
+      <w:rPr>
+        <w:rFonts w:ascii="Wingdings" w:hAnsi="Wingdings" w:hint="default"/>
+        <w:sz w:val="20"/>
+      </w:rPr>
+    </w:lvl>
+  </w:abstractNum>
+  <w:abstractNum w:abstractNumId="21" w15:restartNumberingAfterBreak="0">
     <w:nsid w:val="577B420D"/>
     <w:multiLevelType w:val="multilevel"/>
     <w:tmpl w:val="7CFAE398"/>
@@ -3610,7 +7359,7 @@
       </w:rPr>
     </w:lvl>
   </w:abstractNum>
-  <w:abstractNum w:abstractNumId="13" w15:restartNumberingAfterBreak="0">
+  <w:abstractNum w:abstractNumId="22" w15:restartNumberingAfterBreak="0">
     <w:nsid w:val="5B771F48"/>
     <w:multiLevelType w:val="multilevel"/>
     <w:tmpl w:val="A03C8AA4"/>
@@ -3759,7 +7508,7 @@
       </w:rPr>
     </w:lvl>
   </w:abstractNum>
-  <w:abstractNum w:abstractNumId="14" w15:restartNumberingAfterBreak="0">
+  <w:abstractNum w:abstractNumId="23" w15:restartNumberingAfterBreak="0">
     <w:nsid w:val="5C1730A6"/>
     <w:multiLevelType w:val="multilevel"/>
     <w:tmpl w:val="3D2AF98C"/>
@@ -3908,7 +7657,7 @@
       </w:rPr>
     </w:lvl>
   </w:abstractNum>
-  <w:abstractNum w:abstractNumId="15" w15:restartNumberingAfterBreak="0">
+  <w:abstractNum w:abstractNumId="24" w15:restartNumberingAfterBreak="0">
     <w:nsid w:val="603C2D18"/>
     <w:multiLevelType w:val="multilevel"/>
     <w:tmpl w:val="4E268A00"/>
@@ -4057,7 +7806,7 @@
       </w:rPr>
     </w:lvl>
   </w:abstractNum>
-  <w:abstractNum w:abstractNumId="16" w15:restartNumberingAfterBreak="0">
+  <w:abstractNum w:abstractNumId="25" w15:restartNumberingAfterBreak="0">
     <w:nsid w:val="629B17E9"/>
     <w:multiLevelType w:val="multilevel"/>
     <w:tmpl w:val="094293EA"/>
@@ -4206,7 +7955,7 @@
       </w:rPr>
     </w:lvl>
   </w:abstractNum>
-  <w:abstractNum w:abstractNumId="17" w15:restartNumberingAfterBreak="0">
+  <w:abstractNum w:abstractNumId="26" w15:restartNumberingAfterBreak="0">
     <w:nsid w:val="6AF8678A"/>
     <w:multiLevelType w:val="multilevel"/>
     <w:tmpl w:val="AF6AEBB8"/>
@@ -4323,7 +8072,7 @@
       </w:pPr>
     </w:lvl>
   </w:abstractNum>
-  <w:abstractNum w:abstractNumId="18" w15:restartNumberingAfterBreak="0">
+  <w:abstractNum w:abstractNumId="27" w15:restartNumberingAfterBreak="0">
     <w:nsid w:val="70FE03C0"/>
     <w:multiLevelType w:val="multilevel"/>
     <w:tmpl w:val="31EEC43A"/>
@@ -4472,7 +8221,7 @@
       </w:rPr>
     </w:lvl>
   </w:abstractNum>
-  <w:abstractNum w:abstractNumId="19" w15:restartNumberingAfterBreak="0">
+  <w:abstractNum w:abstractNumId="28" w15:restartNumberingAfterBreak="0">
     <w:nsid w:val="7E304293"/>
     <w:multiLevelType w:val="multilevel"/>
     <w:tmpl w:val="AB486544"/>
@@ -4622,64 +8371,101 @@
     </w:lvl>
   </w:abstractNum>
   <w:num w:numId="1" w16cid:durableId="499930217">
+    <w:abstractNumId w:val="28"/>
+  </w:num>
+  <w:num w:numId="2" w16cid:durableId="1018697730">
+    <w:abstractNumId w:val="2"/>
+  </w:num>
+  <w:num w:numId="3" w16cid:durableId="1145077355">
+    <w:abstractNumId w:val="16"/>
+  </w:num>
+  <w:num w:numId="4" w16cid:durableId="333186173">
+    <w:abstractNumId w:val="7"/>
+  </w:num>
+  <w:num w:numId="5" w16cid:durableId="212471964">
+    <w:abstractNumId w:val="23"/>
+  </w:num>
+  <w:num w:numId="6" w16cid:durableId="1655141322">
+    <w:abstractNumId w:val="24"/>
+  </w:num>
+  <w:num w:numId="7" w16cid:durableId="1787508371">
+    <w:abstractNumId w:val="21"/>
+  </w:num>
+  <w:num w:numId="8" w16cid:durableId="320080598">
+    <w:abstractNumId w:val="22"/>
+  </w:num>
+  <w:num w:numId="9" w16cid:durableId="958802442">
+    <w:abstractNumId w:val="26"/>
+  </w:num>
+  <w:num w:numId="10" w16cid:durableId="202791006">
+    <w:abstractNumId w:val="3"/>
+  </w:num>
+  <w:num w:numId="11" w16cid:durableId="2019306191">
+    <w:abstractNumId w:val="25"/>
+  </w:num>
+  <w:num w:numId="12" w16cid:durableId="934828194">
+    <w:abstractNumId w:val="5"/>
+  </w:num>
+  <w:num w:numId="13" w16cid:durableId="705066508">
+    <w:abstractNumId w:val="4"/>
+  </w:num>
+  <w:num w:numId="14" w16cid:durableId="1130629481">
+    <w:abstractNumId w:val="27"/>
+  </w:num>
+  <w:num w:numId="15" w16cid:durableId="1218318487">
+    <w:abstractNumId w:val="11"/>
+  </w:num>
+  <w:num w:numId="16" w16cid:durableId="1405176850">
+    <w:abstractNumId w:val="14"/>
+  </w:num>
+  <w:num w:numId="17" w16cid:durableId="1804031642">
+    <w:abstractNumId w:val="8"/>
+  </w:num>
+  <w:num w:numId="18" w16cid:durableId="884562267">
+    <w:abstractNumId w:val="6"/>
+  </w:num>
+  <w:num w:numId="19" w16cid:durableId="1877346879">
     <w:abstractNumId w:val="19"/>
   </w:num>
-  <w:num w:numId="2" w16cid:durableId="1018697730">
+  <w:num w:numId="20" w16cid:durableId="2133090530">
+    <w:abstractNumId w:val="15"/>
+  </w:num>
+  <w:num w:numId="21" w16cid:durableId="1254632054">
+    <w:abstractNumId w:val="10"/>
+  </w:num>
+  <w:num w:numId="22" w16cid:durableId="334580458">
+    <w:abstractNumId w:val="1"/>
+  </w:num>
+  <w:num w:numId="23" w16cid:durableId="1641613319">
+    <w:abstractNumId w:val="20"/>
+  </w:num>
+  <w:num w:numId="24" w16cid:durableId="1132871316">
+    <w:abstractNumId w:val="20"/>
+    <w:lvlOverride w:ilvl="1">
+      <w:lvl w:ilvl="1">
+        <w:numFmt w:val="decimal"/>
+        <w:lvlText w:val="%2."/>
+        <w:lvlJc w:val="left"/>
+      </w:lvl>
+    </w:lvlOverride>
+  </w:num>
+  <w:num w:numId="25" w16cid:durableId="1970938252">
     <w:abstractNumId w:val="0"/>
   </w:num>
-  <w:num w:numId="3" w16cid:durableId="1145077355">
-    <w:abstractNumId w:val="10"/>
+  <w:num w:numId="26" w16cid:durableId="1645312215">
+    <w:abstractNumId w:val="18"/>
   </w:num>
-  <w:num w:numId="4" w16cid:durableId="333186173">
-    <w:abstractNumId w:val="5"/>
+  <w:num w:numId="27" w16cid:durableId="1735280325">
+    <w:abstractNumId w:val="17"/>
   </w:num>
-  <w:num w:numId="5" w16cid:durableId="212471964">
-    <w:abstractNumId w:val="14"/>
-  </w:num>
-  <w:num w:numId="6" w16cid:durableId="1655141322">
-    <w:abstractNumId w:val="15"/>
-  </w:num>
-  <w:num w:numId="7" w16cid:durableId="1787508371">
-    <w:abstractNumId w:val="12"/>
-  </w:num>
-  <w:num w:numId="8" w16cid:durableId="320080598">
+  <w:num w:numId="28" w16cid:durableId="1077440913">
     <w:abstractNumId w:val="13"/>
   </w:num>
-  <w:num w:numId="9" w16cid:durableId="958802442">
-    <w:abstractNumId w:val="17"/>
+  <w:num w:numId="29" w16cid:durableId="719519951">
+    <w:abstractNumId w:val="9"/>
   </w:num>
-  <w:num w:numId="10" w16cid:durableId="202791006">
-    <w:abstractNumId w:val="1"/>
-  </w:num>
-  <w:num w:numId="11" w16cid:durableId="2019306191">
-    <w:abstractNumId w:val="16"/>
-  </w:num>
-  <w:num w:numId="12" w16cid:durableId="934828194">
-    <w:abstractNumId w:val="3"/>
-  </w:num>
-  <w:num w:numId="13" w16cid:durableId="705066508">
-    <w:abstractNumId w:val="2"/>
-  </w:num>
-  <w:num w:numId="14" w16cid:durableId="1130629481">
-    <w:abstractNumId w:val="18"/>
-  </w:num>
-  <w:num w:numId="15" w16cid:durableId="1218318487">
-    <w:abstractNumId w:val="7"/>
-  </w:num>
-  <w:num w:numId="16" w16cid:durableId="1405176850">
-    <w:abstractNumId w:val="8"/>
-  </w:num>
-  <w:num w:numId="17" w16cid:durableId="1804031642">
-    <w:abstractNumId w:val="6"/>
-  </w:num>
-  <w:num w:numId="18" w16cid:durableId="884562267">
-    <w:abstractNumId w:val="4"/>
-  </w:num>
-  <w:num w:numId="19" w16cid:durableId="1877346879">
-    <w:abstractNumId w:val="11"/>
-  </w:num>
-  <w:num w:numId="20" w16cid:durableId="2133090530">
-    <w:abstractNumId w:val="9"/>
+  <w:num w:numId="30" w16cid:durableId="1692753544">
+    <w:abstractNumId w:val="12"/>
   </w:num>
 </w:numbering>
 </file>

</xml_diff>